<commit_message>
yo creo que ya quedó, módulo el título
</commit_message>
<xml_diff>
--- a/Resumen.docx
+++ b/Resumen.docx
@@ -1,9 +1,10 @@
 
 <file path=word/document.xml><?xml version="1.0" encoding="utf-8"?>
-<w:document xmlns:wpc="http://schemas.microsoft.com/office/word/2010/wordprocessingCanvas" xmlns:cx="http://schemas.microsoft.com/office/drawing/2014/chartex" xmlns:cx1="http://schemas.microsoft.com/office/drawing/2015/9/8/chartex" xmlns:cx2="http://schemas.microsoft.com/office/drawing/2015/10/21/chartex" xmlns:cx3="http://schemas.microsoft.com/office/drawing/2016/5/9/chartex" xmlns:cx4="http://schemas.microsoft.com/office/drawing/2016/5/10/chartex" xmlns:cx5="http://schemas.microsoft.com/office/drawing/2016/5/11/chartex" xmlns:cx6="http://schemas.microsoft.com/office/drawing/2016/5/12/chartex" xmlns:cx7="http://schemas.microsoft.com/office/drawing/2016/5/13/chartex" xmlns:cx8="http://schemas.microsoft.com/office/drawing/2016/5/14/chartex" xmlns:mc="http://schemas.openxmlformats.org/markup-compatibility/2006" xmlns:aink="http://schemas.microsoft.com/office/drawing/2016/ink" xmlns:am3d="http://schemas.microsoft.com/office/drawing/2017/model3d" xmlns:o="urn:schemas-microsoft-com:office:office" xmlns:oel="http://schemas.microsoft.com/office/2019/extlst" xmlns:r="http://schemas.openxmlformats.org/officeDocument/2006/relationships" xmlns:m="http://schemas.openxmlformats.org/officeDocument/2006/math" xmlns:v="urn:schemas-microsoft-com:vml" xmlns:wp14="http://schemas.microsoft.com/office/word/2010/wordprocessingDrawing" xmlns:wp="http://schemas.openxmlformats.org/drawingml/2006/wordprocessingDrawing" xmlns:w10="urn:schemas-microsoft-com:office:word" xmlns:w="http://schemas.openxmlformats.org/wordprocessingml/2006/main" xmlns:w14="http://schemas.microsoft.com/office/word/2010/wordml" xmlns:w15="http://schemas.microsoft.com/office/word/2012/wordml" xmlns:w16cex="http://schemas.microsoft.com/office/word/2018/wordml/cex" xmlns:w16cid="http://schemas.microsoft.com/office/word/2016/wordml/cid" xmlns:w16="http://schemas.microsoft.com/office/word/2018/wordml" xmlns:w16du="http://schemas.microsoft.com/office/word/2023/wordml/word16du" xmlns:w16sdtdh="http://schemas.microsoft.com/office/word/2020/wordml/sdtdatahash" xmlns:w16sdtfl="http://schemas.microsoft.com/office/word/2024/wordml/sdtformatlock" xmlns:w16se="http://schemas.microsoft.com/office/word/2015/wordml/symex" xmlns:wpg="http://schemas.microsoft.com/office/word/2010/wordprocessingGroup" xmlns:wpi="http://schemas.microsoft.com/office/word/2010/wordprocessingInk" xmlns:wne="http://schemas.microsoft.com/office/word/2006/wordml" xmlns:wps="http://schemas.microsoft.com/office/word/2010/wordprocessingShape" mc:Ignorable="w14 w15 w16se w16cid w16 w16cex w16sdtdh w16sdtfl w16du wp14">
+<w:document xmlns:o="urn:schemas-microsoft-com:office:office" xmlns:r="http://schemas.openxmlformats.org/officeDocument/2006/relationships" xmlns:v="urn:schemas-microsoft-com:vml" xmlns:w="http://schemas.openxmlformats.org/wordprocessingml/2006/main" xmlns:w10="urn:schemas-microsoft-com:office:word" xmlns:wp="http://schemas.openxmlformats.org/drawingml/2006/wordprocessingDrawing" xmlns:pic="http://schemas.openxmlformats.org/drawingml/2006/picture" xmlns:wps="http://schemas.microsoft.com/office/word/2010/wordprocessingShape" xmlns:wpg="http://schemas.microsoft.com/office/word/2010/wordprocessingGroup" xmlns:mc="http://schemas.openxmlformats.org/markup-compatibility/2006" xmlns:wp14="http://schemas.microsoft.com/office/word/2010/wordprocessingDrawing" xmlns:w14="http://schemas.microsoft.com/office/word/2010/wordml" xmlns:w15="http://schemas.microsoft.com/office/word/2012/wordml" mc:Ignorable="w14 wp14 w15">
   <w:body>
     <w:p>
       <w:pPr>
+        <w:pStyle w:val="Normal"/>
         <w:jc w:val="both"/>
         <w:rPr>
           <w:sz w:val="22"/>
@@ -28,24 +29,26 @@
         </w:rPr>
         <w:t xml:space="preserve"> </w:t>
       </w:r>
+      <w:r>
+        <w:rPr>
+          <w:sz w:val="22"/>
+          <w:szCs w:val="22"/>
+        </w:rPr>
+      </w:r>
+      <w:commentRangeEnd w:id="1"/>
+      <w:r>
+        <w:commentReference w:id="1"/>
+      </w:r>
+      <w:r>
+        <w:rPr>
+          <w:sz w:val="22"/>
+          <w:szCs w:val="22"/>
+        </w:rPr>
+      </w:r>
       <w:commentRangeEnd w:id="0"/>
       <w:r>
-        <w:rPr>
-          <w:rStyle w:val="Refdecomentario"/>
-          <w:sz w:val="22"/>
-          <w:szCs w:val="22"/>
-        </w:rPr>
         <w:commentReference w:id="0"/>
       </w:r>
-      <w:commentRangeEnd w:id="1"/>
-      <w:r>
-        <w:rPr>
-          <w:rStyle w:val="Refdecomentario"/>
-          <w:sz w:val="22"/>
-          <w:szCs w:val="22"/>
-        </w:rPr>
-        <w:commentReference w:id="1"/>
-      </w:r>
       <w:r>
         <w:rPr>
           <w:sz w:val="22"/>
@@ -61,13 +64,14 @@
         </w:rPr>
         <w:t xml:space="preserve"> óptica de eritrocitos </w:t>
       </w:r>
+      <w:r>
+        <w:rPr>
+          <w:sz w:val="22"/>
+          <w:szCs w:val="22"/>
+        </w:rPr>
+      </w:r>
       <w:commentRangeEnd w:id="2"/>
       <w:r>
-        <w:rPr>
-          <w:rStyle w:val="Refdecomentario"/>
-          <w:sz w:val="22"/>
-          <w:szCs w:val="22"/>
-        </w:rPr>
         <w:commentReference w:id="2"/>
       </w:r>
       <w:r>
@@ -80,6 +84,7 @@
     </w:p>
     <w:p>
       <w:pPr>
+        <w:pStyle w:val="Normal"/>
         <w:jc w:val="both"/>
         <w:rPr>
           <w:sz w:val="22"/>
@@ -150,6 +155,7 @@
     </w:p>
     <w:p>
       <w:pPr>
+        <w:pStyle w:val="Normal"/>
         <w:jc w:val="both"/>
         <w:rPr>
           <w:sz w:val="22"/>
@@ -174,9 +180,10 @@
     </w:p>
     <w:p>
       <w:pPr>
+        <w:pStyle w:val="Normal"/>
         <w:jc w:val="both"/>
         <w:rPr>
-          <w:ins w:id="3" w:author="DANA LARISSA LUNA GONZALEZ" w:date="2026-05-07T18:47:00Z" w16du:dateUtc="2026-05-08T00:47:00Z"/>
+          <w:ins w:id="0" w:author="DANA LARISSA LUNA GONZALEZ" w:date="2026-05-07T18:47:00Z"/>
           <w:sz w:val="22"/>
           <w:szCs w:val="22"/>
         </w:rPr>
@@ -191,6 +198,7 @@
     </w:p>
     <w:p>
       <w:pPr>
+        <w:pStyle w:val="Normal"/>
         <w:jc w:val="both"/>
         <w:rPr>
           <w:sz w:val="22"/>
@@ -202,91 +210,7 @@
           <w:sz w:val="22"/>
           <w:szCs w:val="22"/>
         </w:rPr>
-        <w:t xml:space="preserve">Enfermedades hematológicas, </w:t>
-      </w:r>
-      <w:r>
-        <w:rPr>
-          <w:sz w:val="22"/>
-          <w:szCs w:val="22"/>
-        </w:rPr>
-        <w:t>como diversos</w:t>
-      </w:r>
-      <w:r>
-        <w:rPr>
-          <w:sz w:val="22"/>
-          <w:szCs w:val="22"/>
-        </w:rPr>
-        <w:t xml:space="preserve"> tipos de anemia, se relacionan con alteraciones en la composición de los</w:t>
-      </w:r>
-      <w:r>
-        <w:rPr>
-          <w:sz w:val="22"/>
-          <w:szCs w:val="22"/>
-        </w:rPr>
-        <w:t xml:space="preserve"> </w:t>
-      </w:r>
-      <w:r>
-        <w:rPr>
-          <w:sz w:val="22"/>
-          <w:szCs w:val="22"/>
-        </w:rPr>
-        <w:t>eritrocitos, conocidos como glóbulos rojos</w:t>
-      </w:r>
-      <w:r>
-        <w:rPr>
-          <w:sz w:val="22"/>
-          <w:szCs w:val="22"/>
-        </w:rPr>
-        <w:t>.</w:t>
-      </w:r>
-      <w:r>
-        <w:rPr>
-          <w:sz w:val="22"/>
-          <w:szCs w:val="22"/>
-        </w:rPr>
-        <w:t xml:space="preserve"> Estas alteraciones modifican de manera clínicamente significativa la geometría, tamaño y composición interna de los eritrocitos. En </w:t>
-      </w:r>
-      <w:r>
-        <w:rPr>
-          <w:sz w:val="22"/>
-          <w:szCs w:val="22"/>
-        </w:rPr>
-        <w:t>particular,</w:t>
-      </w:r>
-      <w:r>
-        <w:rPr>
-          <w:sz w:val="22"/>
-          <w:szCs w:val="22"/>
-        </w:rPr>
-        <w:t xml:space="preserve"> la concentración de hemoglobina corpuscular media (CHCM) en los </w:t>
-      </w:r>
-      <w:r>
-        <w:rPr>
-          <w:sz w:val="22"/>
-          <w:szCs w:val="22"/>
-        </w:rPr>
-        <w:t xml:space="preserve">eritrocitos </w:t>
-      </w:r>
-      <w:r>
-        <w:rPr>
-          <w:sz w:val="22"/>
-          <w:szCs w:val="22"/>
-        </w:rPr>
-        <w:t xml:space="preserve">modifica su índice de refracción </w:t>
-      </w:r>
-      <w:r>
-        <w:rPr>
-          <w:sz w:val="22"/>
-          <w:szCs w:val="22"/>
-        </w:rPr>
-        <w:t xml:space="preserve">afectando </w:t>
-      </w:r>
-      <w:r>
-        <w:rPr>
-          <w:sz w:val="22"/>
-          <w:szCs w:val="22"/>
-        </w:rPr>
-        <w:t xml:space="preserve">tanto su funcionalidad fisiológica como sus propiedades de esparcimiento óptico. En este trabajo se estudia numéricamente la respuesta óptica de un eritrocito sano mediante el método </w:t>
+        <w:t xml:space="preserve">Enfermedades hematológicas, como diversos tipos de anemia, se relacionan con alteraciones en la composición de los eritrocitos, conocidos como glóbulos rojos. Estas alteraciones modifican de manera clínicamente significativa la geometría, tamaño y composición interna de los eritrocitos. En particular, la concentración de hemoglobina corpuscular media (CHCM) en los eritrocitos modifica su índice de refracción afectando tanto su funcionalidad fisiológica como sus propiedades de esparcimiento óptico. En este trabajo se estudia numéricamente la respuesta óptica de un eritrocito sano mediante el método </w:t>
       </w:r>
       <w:r>
         <w:rPr>
@@ -302,52 +226,168 @@
           <w:sz w:val="22"/>
           <w:szCs w:val="22"/>
         </w:rPr>
-        <w:t xml:space="preserve"> (FIT), implementado en el software comercial CST Studio. La geometría del eritrocito se modela mediante óvalos de Cassini, mientras que la función dieléctrica se construye a partir de un ajuste analítico a datos experimentales reportados en la literatura, al cual se le aplican las relaciones sustractivas de Kramers–Kronig</w:t>
-      </w:r>
-      <w:r>
-        <w:rPr>
-          <w:sz w:val="22"/>
-          <w:szCs w:val="22"/>
-        </w:rPr>
-        <w:t>. La función dieléctrica obtenida cumple causalidad, necesaria para el método numérico empleado y muestra una mejora respecto a otros ajustes previamente reportados</w:t>
-      </w:r>
-      <w:r>
-        <w:rPr>
-          <w:sz w:val="22"/>
-          <w:szCs w:val="22"/>
-        </w:rPr>
-        <w:t>.  Como resultado, se obtiene</w:t>
-      </w:r>
-      <w:r>
-        <w:rPr>
-          <w:sz w:val="22"/>
-          <w:szCs w:val="22"/>
-        </w:rPr>
-        <w:t xml:space="preserve">n propiedades ópticas </w:t>
-      </w:r>
-      <w:r>
-        <w:rPr>
-          <w:sz w:val="22"/>
-          <w:szCs w:val="22"/>
-        </w:rPr>
-        <w:t>del eritrocito al determinarse numéricamente la sección transversal de extinción y la distribución angular del campo esparcido, es decir, cantidades medibles en el campo lejano.  Este trabajo proporciona una base para futuros estudios comparativos con eritrocitos patológicos.</w:t>
-      </w:r>
-    </w:p>
-    <w:p>
-      <w:pPr>
+        <w:t xml:space="preserve"> (FIT), implementado en el software comercial CST Studio. La geometría del eritrocito se modela mediante óvalos de Cassini, mientras que la función dieléctrica se construye a partir de un ajuste analítico a datos experimentales reportados en la literatura,</w:t>
+      </w:r>
+      <w:del w:id="1" w:author="Jonathan Urrutia" w:date="2026-05-08T12:57:55Z">
+        <w:r>
+          <w:rPr>
+            <w:sz w:val="22"/>
+            <w:szCs w:val="22"/>
+          </w:rPr>
+          <w:delText xml:space="preserve"> al cual se le aplican las relaciones sustractivas de Kramers–Kronig. </w:delText>
+        </w:r>
+      </w:del>
+      <w:ins w:id="2" w:author="Jonathan Urrutia" w:date="2026-05-08T12:57:55Z">
+        <w:r>
+          <w:rPr>
+            <w:sz w:val="22"/>
+            <w:szCs w:val="22"/>
+          </w:rPr>
+          <w:t xml:space="preserve">. </w:t>
+        </w:r>
+      </w:ins>
+      <w:r>
+        <w:rPr>
+          <w:sz w:val="22"/>
+          <w:szCs w:val="22"/>
+        </w:rPr>
+        <w:t xml:space="preserve">La función dieléctrica obtenida </w:t>
+      </w:r>
+      <w:ins w:id="3" w:author="Jonathan Urrutia" w:date="2026-05-08T12:58:10Z">
+        <w:r>
+          <w:rPr>
+            <w:sz w:val="22"/>
+            <w:szCs w:val="22"/>
+          </w:rPr>
+          <w:t xml:space="preserve">se construye a partir de las relaciones sustractivas de Kramers-Kronig,  por lo que se garantiza la </w:t>
+        </w:r>
+      </w:ins>
+      <w:del w:id="4" w:author="Jonathan Urrutia" w:date="2026-05-08T12:58:49Z">
+        <w:r>
+          <w:rPr>
+            <w:sz w:val="22"/>
+            <w:szCs w:val="22"/>
+          </w:rPr>
+          <w:delText xml:space="preserve">cumple </w:delText>
+        </w:r>
+      </w:del>
+      <w:r>
+        <w:rPr>
+          <w:sz w:val="22"/>
+          <w:szCs w:val="22"/>
+        </w:rPr>
+        <w:t>causalidad</w:t>
+      </w:r>
+      <w:ins w:id="5" w:author="Jonathan Urrutia" w:date="2026-05-08T12:58:54Z">
+        <w:r>
+          <w:rPr>
+            <w:sz w:val="22"/>
+            <w:szCs w:val="22"/>
+          </w:rPr>
+          <w:t xml:space="preserve"> en su formulación, condicion necesaria para el emlpeo del método Fit.</w:t>
+        </w:r>
+      </w:ins>
+      <w:del w:id="6" w:author="Jonathan Urrutia" w:date="2026-05-08T12:59:05Z">
+        <w:r>
+          <w:rPr>
+            <w:sz w:val="22"/>
+            <w:szCs w:val="22"/>
+          </w:rPr>
+          <w:delText xml:space="preserve">, necesaria para el método numérico empleado y </w:delText>
+        </w:r>
+      </w:del>
+      <w:ins w:id="7" w:author="Jonathan Urrutia" w:date="2026-05-08T12:59:54Z">
+        <w:r>
+          <w:rPr>
+            <w:sz w:val="22"/>
+            <w:szCs w:val="22"/>
+          </w:rPr>
+          <w:t xml:space="preserve">. </w:t>
+        </w:r>
+      </w:ins>
+      <w:ins w:id="8" w:author="Jonathan Urrutia" w:date="2026-05-08T12:59:54Z">
+        <w:r>
+          <w:rPr>
+            <w:sz w:val="22"/>
+            <w:szCs w:val="22"/>
+          </w:rPr>
+          <w:t xml:space="preserve">Adicionalmente, el ajuste obtenido en este trabajo </w:t>
+        </w:r>
+      </w:ins>
+      <w:r>
+        <w:rPr>
+          <w:sz w:val="22"/>
+          <w:szCs w:val="22"/>
+        </w:rPr>
+        <w:t xml:space="preserve">muestra una mejora respecto a otros </w:t>
+      </w:r>
+      <w:del w:id="9" w:author="Jonathan Urrutia" w:date="2026-05-08T13:00:15Z">
+        <w:r>
+          <w:rPr>
+            <w:sz w:val="22"/>
+            <w:szCs w:val="22"/>
+          </w:rPr>
+          <w:delText>ajustes previamente</w:delText>
+        </w:r>
+      </w:del>
+      <w:r>
+        <w:rPr>
+          <w:sz w:val="22"/>
+          <w:szCs w:val="22"/>
+        </w:rPr>
+        <w:t xml:space="preserve"> reportados</w:t>
+      </w:r>
+      <w:ins w:id="10" w:author="Jonathan Urrutia" w:date="2026-05-08T13:00:17Z">
+        <w:r>
+          <w:rPr>
+            <w:sz w:val="22"/>
+            <w:szCs w:val="22"/>
+          </w:rPr>
+          <w:t xml:space="preserve"> </w:t>
+        </w:r>
+      </w:ins>
+      <w:ins w:id="11" w:author="Jonathan Urrutia" w:date="2026-05-08T13:00:17Z">
+        <w:r>
+          <w:rPr>
+            <w:sz w:val="22"/>
+            <w:szCs w:val="22"/>
+          </w:rPr>
+          <w:t>previamente en la lteratura</w:t>
+        </w:r>
+      </w:ins>
+      <w:r>
+        <w:rPr>
+          <w:sz w:val="22"/>
+          <w:szCs w:val="22"/>
+        </w:rPr>
+        <w:t>.  Como resultado, se obtienen propiedades ópticas del eritrocito al determinarse numéricamente la sección transversal de extinción y la distribución angular del campo esparcido, es decir, cantidades medibles en el campo lejano.  Este trabajo proporciona una base para futuros estudios comparativos con eritrocitos patológicos.</w:t>
+      </w:r>
+    </w:p>
+    <w:p>
+      <w:pPr>
+        <w:pStyle w:val="Normal"/>
         <w:jc w:val="both"/>
         <w:rPr>
-          <w:ins w:id="4" w:author="DANA LARISSA LUNA GONZALEZ" w:date="2026-05-07T18:47:00Z" w16du:dateUtc="2026-05-08T00:47:00Z"/>
-          <w:sz w:val="22"/>
-          <w:szCs w:val="22"/>
-        </w:rPr>
-      </w:pPr>
-    </w:p>
-    <w:p>
-      <w:pPr>
+          <w:ins w:id="13" w:author="DANA LARISSA LUNA GONZALEZ" w:date="2026-05-07T18:47:00Z"/>
+          <w:sz w:val="22"/>
+          <w:szCs w:val="22"/>
+        </w:rPr>
+      </w:pPr>
+      <w:ins w:id="12" w:author="DANA LARISSA LUNA GONZALEZ" w:date="2026-05-07T18:47:00Z">
+        <w:r>
+          <w:rPr>
+            <w:sz w:val="22"/>
+            <w:szCs w:val="22"/>
+          </w:rPr>
+        </w:r>
+      </w:ins>
+    </w:p>
+    <w:p>
+      <w:pPr>
+        <w:pStyle w:val="Normal"/>
         <w:jc w:val="both"/>
         <w:rPr>
-          <w:ins w:id="5" w:author="DANA LARISSA LUNA GONZALEZ" w:date="2026-05-07T18:47:00Z" w16du:dateUtc="2026-05-08T00:47:00Z"/>
+          <w:ins w:id="14" w:author="DANA LARISSA LUNA GONZALEZ" w:date="2026-05-07T18:47:00Z"/>
           <w:sz w:val="22"/>
           <w:szCs w:val="22"/>
         </w:rPr>
@@ -362,23 +402,33 @@
     </w:p>
     <w:p>
       <w:pPr>
+        <w:pStyle w:val="Normal"/>
         <w:jc w:val="both"/>
         <w:rPr>
-          <w:ins w:id="6" w:author="DANA LARISSA LUNA GONZALEZ" w:date="2026-05-06T21:59:00Z"/>
-          <w:sz w:val="22"/>
-          <w:szCs w:val="22"/>
-        </w:rPr>
-      </w:pPr>
-    </w:p>
-    <w:p>
-      <w:pPr>
+          <w:ins w:id="16" w:author="DANA LARISSA LUNA GONZALEZ" w:date="2026-05-06T21:59:00Z"/>
+          <w:sz w:val="22"/>
+          <w:szCs w:val="22"/>
+        </w:rPr>
+      </w:pPr>
+      <w:ins w:id="15" w:author="DANA LARISSA LUNA GONZALEZ" w:date="2026-05-06T21:59:00Z">
+        <w:r>
+          <w:rPr>
+            <w:sz w:val="22"/>
+            <w:szCs w:val="22"/>
+          </w:rPr>
+        </w:r>
+      </w:ins>
+    </w:p>
+    <w:p>
+      <w:pPr>
+        <w:pStyle w:val="Normal"/>
         <w:jc w:val="both"/>
         <w:rPr>
           <w:sz w:val="22"/>
           <w:szCs w:val="22"/>
         </w:rPr>
       </w:pPr>
-      <w:del w:id="7" w:author="Jonathan Urrutia" w:date="2026-05-07T12:08:00Z">
+      <w:del w:id="17" w:author="Jonathan Urrutia" w:date="2026-05-07T12:08:00Z">
         <w:r>
           <w:rPr>
             <w:sz w:val="22"/>
@@ -387,7 +437,7 @@
           <w:delText>Diversas e</w:delText>
         </w:r>
       </w:del>
-      <w:ins w:id="8" w:author="Jonathan Urrutia" w:date="2026-05-07T12:08:00Z">
+      <w:ins w:id="18" w:author="Jonathan Urrutia" w:date="2026-05-07T12:08:00Z">
         <w:r>
           <w:rPr>
             <w:sz w:val="22"/>
@@ -403,7 +453,7 @@
         </w:rPr>
         <w:t xml:space="preserve">nfermedades hematológicas, como </w:t>
       </w:r>
-      <w:del w:id="9" w:author="Jonathan Urrutia" w:date="2026-05-07T12:09:00Z">
+      <w:del w:id="19" w:author="Jonathan Urrutia" w:date="2026-05-07T12:09:00Z">
         <w:r>
           <w:rPr>
             <w:sz w:val="22"/>
@@ -412,7 +462,7 @@
           <w:delText xml:space="preserve">distintos </w:delText>
         </w:r>
       </w:del>
-      <w:ins w:id="10" w:author="Jonathan Urrutia" w:date="2026-05-07T12:09:00Z">
+      <w:ins w:id="20" w:author="Jonathan Urrutia" w:date="2026-05-07T12:09:00Z">
         <w:r>
           <w:rPr>
             <w:sz w:val="22"/>
@@ -428,7 +478,7 @@
         </w:rPr>
         <w:t xml:space="preserve">tipos de anemia, </w:t>
       </w:r>
-      <w:del w:id="11" w:author="Jonathan Urrutia" w:date="2026-05-07T12:09:00Z">
+      <w:del w:id="21" w:author="Jonathan Urrutia" w:date="2026-05-07T12:09:00Z">
         <w:r>
           <w:rPr>
             <w:sz w:val="22"/>
@@ -437,7 +487,7 @@
           <w:delText>están</w:delText>
         </w:r>
       </w:del>
-      <w:ins w:id="12" w:author="Jonathan Urrutia" w:date="2026-05-07T12:09:00Z">
+      <w:ins w:id="22" w:author="Jonathan Urrutia" w:date="2026-05-07T12:09:00Z">
         <w:r>
           <w:rPr>
             <w:sz w:val="22"/>
@@ -453,7 +503,7 @@
         </w:rPr>
         <w:t xml:space="preserve"> </w:t>
       </w:r>
-      <w:del w:id="13" w:author="Jonathan Urrutia" w:date="2026-05-07T12:09:00Z">
+      <w:del w:id="23" w:author="Jonathan Urrutia" w:date="2026-05-07T12:09:00Z">
         <w:r>
           <w:rPr>
             <w:sz w:val="22"/>
@@ -462,7 +512,7 @@
           <w:delText>relacionadas</w:delText>
         </w:r>
       </w:del>
-      <w:ins w:id="14" w:author="Jonathan Urrutia" w:date="2026-05-07T12:09:00Z">
+      <w:ins w:id="24" w:author="Jonathan Urrutia" w:date="2026-05-07T12:09:00Z">
         <w:r>
           <w:rPr>
             <w:sz w:val="22"/>
@@ -478,7 +528,7 @@
         </w:rPr>
         <w:t xml:space="preserve"> con alteraciones en l</w:t>
       </w:r>
-      <w:ins w:id="15" w:author="Jonathan Urrutia" w:date="2026-05-07T12:09:00Z">
+      <w:ins w:id="25" w:author="Jonathan Urrutia" w:date="2026-05-07T12:09:00Z">
         <w:r>
           <w:rPr>
             <w:sz w:val="22"/>
@@ -487,7 +537,7 @@
           <w:t>a composición de los</w:t>
         </w:r>
       </w:ins>
-      <w:del w:id="16" w:author="Jonathan Urrutia" w:date="2026-05-07T12:09:00Z">
+      <w:del w:id="26" w:author="Jonathan Urrutia" w:date="2026-05-07T12:09:00Z">
         <w:r>
           <w:rPr>
             <w:sz w:val="22"/>
@@ -503,7 +553,7 @@
         </w:rPr>
         <w:t>eritrocitos</w:t>
       </w:r>
-      <w:ins w:id="17" w:author="Jonathan Urrutia" w:date="2026-05-07T12:09:00Z">
+      <w:ins w:id="27" w:author="Jonathan Urrutia" w:date="2026-05-07T12:09:00Z">
         <w:r>
           <w:rPr>
             <w:sz w:val="22"/>
@@ -512,7 +562,7 @@
           <w:t>, conocidos como</w:t>
         </w:r>
       </w:ins>
-      <w:del w:id="18" w:author="Jonathan Urrutia" w:date="2026-05-07T12:09:00Z">
+      <w:del w:id="28" w:author="Jonathan Urrutia" w:date="2026-05-07T12:09:00Z">
         <w:r>
           <w:rPr>
             <w:sz w:val="22"/>
@@ -521,7 +571,7 @@
           <w:delText xml:space="preserve"> (</w:delText>
         </w:r>
       </w:del>
-      <w:ins w:id="19" w:author="Jonathan Urrutia" w:date="2026-05-07T12:09:00Z">
+      <w:ins w:id="29" w:author="Jonathan Urrutia" w:date="2026-05-07T12:09:00Z">
         <w:r>
           <w:rPr>
             <w:sz w:val="22"/>
@@ -537,7 +587,7 @@
         </w:rPr>
         <w:t>glóbulos rojos)</w:t>
       </w:r>
-      <w:del w:id="20" w:author="Jonathan Urrutia" w:date="2026-05-07T12:09:00Z">
+      <w:del w:id="30" w:author="Jonathan Urrutia" w:date="2026-05-07T12:09:00Z">
         <w:r>
           <w:rPr>
             <w:sz w:val="22"/>
@@ -553,7 +603,7 @@
         </w:rPr>
         <w:t xml:space="preserve"> Estas alteraciones modifican de manera clínicamente significativa la geometría, </w:t>
       </w:r>
-      <w:del w:id="21" w:author="Jonathan Urrutia" w:date="2026-05-07T12:10:00Z">
+      <w:del w:id="31" w:author="Jonathan Urrutia" w:date="2026-05-07T12:10:00Z">
         <w:r>
           <w:rPr>
             <w:sz w:val="22"/>
@@ -569,7 +619,7 @@
         </w:rPr>
         <w:t xml:space="preserve"> tamaño y </w:t>
       </w:r>
-      <w:del w:id="22" w:author="Jonathan Urrutia" w:date="2026-05-07T12:10:00Z">
+      <w:del w:id="32" w:author="Jonathan Urrutia" w:date="2026-05-07T12:10:00Z">
         <w:r>
           <w:rPr>
             <w:sz w:val="22"/>
@@ -585,7 +635,7 @@
         </w:rPr>
         <w:t xml:space="preserve"> composición interna de los eritrocitos</w:t>
       </w:r>
-      <w:ins w:id="23" w:author="Jonathan Urrutia" w:date="2026-05-07T12:10:00Z">
+      <w:ins w:id="33" w:author="Jonathan Urrutia" w:date="2026-05-07T12:10:00Z">
         <w:r>
           <w:rPr>
             <w:sz w:val="22"/>
@@ -594,7 +644,7 @@
           <w:t>.</w:t>
         </w:r>
       </w:ins>
-      <w:del w:id="24" w:author="Jonathan Urrutia" w:date="2026-05-07T12:10:00Z">
+      <w:del w:id="34" w:author="Jonathan Urrutia" w:date="2026-05-07T12:10:00Z">
         <w:r>
           <w:rPr>
             <w:sz w:val="22"/>
@@ -603,7 +653,7 @@
           <w:delText>,</w:delText>
         </w:r>
       </w:del>
-      <w:ins w:id="25" w:author="Jonathan Urrutia" w:date="2026-05-07T12:10:00Z">
+      <w:ins w:id="35" w:author="Jonathan Urrutia" w:date="2026-05-07T12:10:00Z">
         <w:r>
           <w:rPr>
             <w:sz w:val="22"/>
@@ -612,7 +662,7 @@
           <w:t xml:space="preserve"> En particaulr</w:t>
         </w:r>
       </w:ins>
-      <w:del w:id="26" w:author="Jonathan Urrutia" w:date="2026-05-07T12:10:00Z">
+      <w:del w:id="36" w:author="Jonathan Urrutia" w:date="2026-05-07T12:10:00Z">
         <w:r>
           <w:rPr>
             <w:sz w:val="22"/>
@@ -628,7 +678,7 @@
         </w:rPr>
         <w:t xml:space="preserve"> la concentración de hemoglobina corpuscular media (CHCM)</w:t>
       </w:r>
-      <w:ins w:id="27" w:author="Jonathan Urrutia" w:date="2026-05-07T12:10:00Z">
+      <w:ins w:id="37" w:author="Jonathan Urrutia" w:date="2026-05-07T12:10:00Z">
         <w:r>
           <w:rPr>
             <w:sz w:val="22"/>
@@ -644,7 +694,7 @@
         </w:rPr>
         <w:t xml:space="preserve">, </w:t>
       </w:r>
-      <w:del w:id="28" w:author="Jonathan Urrutia" w:date="2026-05-07T12:11:00Z">
+      <w:del w:id="38" w:author="Jonathan Urrutia" w:date="2026-05-07T12:11:00Z">
         <w:r>
           <w:rPr>
             <w:sz w:val="22"/>
@@ -653,7 +703,7 @@
           <w:delText>modificando</w:delText>
         </w:r>
       </w:del>
-      <w:ins w:id="29" w:author="Jonathan Urrutia" w:date="2026-05-07T12:11:00Z">
+      <w:ins w:id="39" w:author="Jonathan Urrutia" w:date="2026-05-07T12:11:00Z">
         <w:r>
           <w:rPr>
             <w:sz w:val="22"/>
@@ -669,7 +719,7 @@
         </w:rPr>
         <w:t xml:space="preserve"> su índice de refracción</w:t>
       </w:r>
-      <w:ins w:id="30" w:author="Jonathan Urrutia" w:date="2026-05-07T12:11:00Z">
+      <w:ins w:id="40" w:author="Jonathan Urrutia" w:date="2026-05-07T12:11:00Z">
         <w:r>
           <w:rPr>
             <w:sz w:val="22"/>
@@ -678,7 +728,7 @@
           <w:t>,</w:t>
         </w:r>
       </w:ins>
-      <w:del w:id="31" w:author="Jonathan Urrutia" w:date="2026-05-07T12:11:00Z">
+      <w:del w:id="41" w:author="Jonathan Urrutia" w:date="2026-05-07T12:11:00Z">
         <w:r>
           <w:rPr>
             <w:sz w:val="22"/>
@@ -710,7 +760,7 @@
         </w:rPr>
         <w:t xml:space="preserve"> (FIT), implementado en el software comercial CST Studio. La geometría del eritrocito se modela mediante óvalos de Cassini, mientras que la función dieléctrica se construye a partir de un ajuste analítico a datos experimentales reportados en la literatura, al cual se le aplican las relaciones sustractivas de Kramers–Kronig </w:t>
       </w:r>
-      <w:del w:id="32" w:author="Jonathan Urrutia" w:date="2026-05-07T12:11:00Z">
+      <w:del w:id="42" w:author="Jonathan Urrutia" w:date="2026-05-07T12:11:00Z">
         <w:r>
           <w:rPr>
             <w:sz w:val="22"/>
@@ -719,7 +769,7 @@
           <w:delText xml:space="preserve">para garantizar </w:delText>
         </w:r>
       </w:del>
-      <w:ins w:id="33" w:author="Jonathan Urrutia" w:date="2026-05-07T12:11:00Z">
+      <w:ins w:id="43" w:author="Jonathan Urrutia" w:date="2026-05-07T12:11:00Z">
         <w:r>
           <w:rPr>
             <w:sz w:val="22"/>
@@ -728,7 +778,7 @@
           <w:t xml:space="preserve">garantizando </w:t>
         </w:r>
       </w:ins>
-      <w:commentRangeStart w:id="34"/>
+      <w:commentRangeStart w:id="3"/>
       <w:r>
         <w:rPr>
           <w:sz w:val="22"/>
@@ -736,45 +786,46 @@
         </w:rPr>
         <w:t>causalidad.</w:t>
       </w:r>
-      <w:commentRangeEnd w:id="34"/>
-      <w:r>
-        <w:rPr>
-          <w:rStyle w:val="Refdecomentario"/>
-          <w:sz w:val="22"/>
-          <w:szCs w:val="22"/>
-        </w:rPr>
-        <w:commentReference w:id="34"/>
-      </w:r>
-      <w:r>
-        <w:rPr>
-          <w:sz w:val="22"/>
-          <w:szCs w:val="22"/>
-        </w:rPr>
-        <w:t xml:space="preserve">  Como resultado, se obtiene una caracterización óptica del eritrocito al determinarse numéricamente </w:t>
-      </w:r>
-      <w:r>
-        <w:rPr>
-          <w:sz w:val="22"/>
-          <w:szCs w:val="22"/>
-        </w:rPr>
-        <w:lastRenderedPageBreak/>
-        <w:t>la sección transversal de extinción y la distribución angular del campo esparcido, es decir, cantidades medibles en el campo lejano.  Este trabajo proporciona una base para futuros estudios comparativos con eritrocitos patológicos.</w:t>
-      </w:r>
-    </w:p>
-    <w:p>
-      <w:pPr>
+      <w:r>
+        <w:rPr>
+          <w:sz w:val="22"/>
+          <w:szCs w:val="22"/>
+        </w:rPr>
+      </w:r>
+      <w:commentRangeEnd w:id="3"/>
+      <w:r>
+        <w:commentReference w:id="3"/>
+      </w:r>
+      <w:r>
+        <w:rPr>
+          <w:sz w:val="22"/>
+          <w:szCs w:val="22"/>
+        </w:rPr>
+        <w:t xml:space="preserve">  Como resultado, se obtiene una caracterización óptica del eritrocito al determinarse numéricamente la sección transversal de extinción y la distribución angular del campo esparcido, es decir, cantidades medibles en el campo lejano.  Este trabajo proporciona una base para futuros estudios comparativos con eritrocitos patológicos.</w:t>
+      </w:r>
+    </w:p>
+    <w:p>
+      <w:pPr>
+        <w:pStyle w:val="Normal"/>
         <w:jc w:val="both"/>
         <w:rPr>
           <w:sz w:val="22"/>
           <w:szCs w:val="22"/>
         </w:rPr>
       </w:pPr>
-    </w:p>
-    <w:p>
-      <w:pPr>
+      <w:r>
+        <w:rPr>
+          <w:sz w:val="22"/>
+          <w:szCs w:val="22"/>
+        </w:rPr>
+      </w:r>
+    </w:p>
+    <w:p>
+      <w:pPr>
+        <w:pStyle w:val="Normal"/>
         <w:jc w:val="both"/>
         <w:rPr>
-          <w:del w:id="35" w:author="DANA LARISSA LUNA GONZALEZ" w:date="2026-05-06T21:59:00Z"/>
+          <w:del w:id="44" w:author="DANA LARISSA LUNA GONZALEZ" w:date="2026-05-06T21:59:00Z"/>
           <w:sz w:val="22"/>
           <w:szCs w:val="22"/>
         </w:rPr>
@@ -789,6 +840,7 @@
     </w:p>
     <w:p>
       <w:pPr>
+        <w:pStyle w:val="Normal"/>
         <w:jc w:val="both"/>
         <w:rPr>
           <w:sz w:val="22"/>
@@ -802,7 +854,7 @@
         </w:rPr>
         <w:t xml:space="preserve">Diversas enfermedades hematológicas, como distintos tipos de anemia, están </w:t>
       </w:r>
-      <w:del w:id="36" w:author="Jonathan Urrutia" w:date="2026-05-06T16:27:00Z">
+      <w:del w:id="45" w:author="Jonathan Urrutia" w:date="2026-05-06T16:27:00Z">
         <w:r>
           <w:rPr>
             <w:sz w:val="22"/>
@@ -818,7 +870,7 @@
         </w:rPr>
         <w:t>relacionadas con alteraciones en los eritrocitos (glóbulos rojos). La geometría, el tamaño y la composición interna de los eritrocitos, particularmente la concentración de hemoglobina corpuscular media (CHCM),</w:t>
       </w:r>
-      <w:del w:id="37" w:author="Jonathan Urrutia" w:date="2026-05-06T16:27:00Z">
+      <w:del w:id="46" w:author="Jonathan Urrutia" w:date="2026-05-06T16:27:00Z">
         <w:r>
           <w:rPr>
             <w:sz w:val="22"/>
@@ -834,7 +886,7 @@
         </w:rPr>
         <w:t xml:space="preserve"> variar de manera clínicamente significativa, modificando su índice de refracción </w:t>
       </w:r>
-      <w:del w:id="38" w:author="Jonathan Urrutia" w:date="2026-05-06T16:28:00Z">
+      <w:del w:id="47" w:author="Jonathan Urrutia" w:date="2026-05-06T16:28:00Z">
         <w:r>
           <w:rPr>
             <w:sz w:val="22"/>
@@ -866,7 +918,7 @@
         </w:rPr>
         <w:t xml:space="preserve"> (FIT), implementado en el software</w:t>
       </w:r>
-      <w:ins w:id="39" w:author="Jonathan Urrutia" w:date="2026-05-06T16:28:00Z">
+      <w:ins w:id="48" w:author="Jonathan Urrutia" w:date="2026-05-06T16:28:00Z">
         <w:r>
           <w:rPr>
             <w:sz w:val="22"/>
@@ -882,7 +934,7 @@
         </w:rPr>
         <w:t xml:space="preserve"> CST Studio. La geometría del eritrocito se modela mediante óvalos de Cassini, mientras que la función dieléctrica se construye a partir de un ajuste analítico a datos experimentales reportados en la literatura, al cual se le aplican las relaciones sustractivas de Kramers–Kronig para garantizar causalidad. </w:t>
       </w:r>
-      <w:del w:id="40" w:author="Jonathan Urrutia" w:date="2026-05-06T16:29:00Z">
+      <w:del w:id="49" w:author="Jonathan Urrutia" w:date="2026-05-06T16:29:00Z">
         <w:r>
           <w:rPr>
             <w:sz w:val="22"/>
@@ -898,7 +950,7 @@
         </w:rPr>
         <w:t xml:space="preserve"> </w:t>
       </w:r>
-      <w:ins w:id="41" w:author="Jonathan Urrutia" w:date="2026-05-06T16:29:00Z">
+      <w:ins w:id="50" w:author="Jonathan Urrutia" w:date="2026-05-06T16:29:00Z">
         <w:r>
           <w:rPr>
             <w:sz w:val="22"/>
@@ -907,7 +959,7 @@
           <w:t xml:space="preserve">Como resultado, se obtiene una caracterizción óptica del eritrosito al determinarse numéricamente </w:t>
         </w:r>
       </w:ins>
-      <w:del w:id="42" w:author="Jonathan Urrutia" w:date="2026-05-06T16:30:00Z">
+      <w:del w:id="51" w:author="Jonathan Urrutia" w:date="2026-05-06T16:30:00Z">
         <w:r>
           <w:rPr>
             <w:sz w:val="22"/>
@@ -923,7 +975,7 @@
         </w:rPr>
         <w:t>sección transversal de extinción y la distribución angular del campo esparcido</w:t>
       </w:r>
-      <w:ins w:id="43" w:author="Jonathan Urrutia" w:date="2026-05-06T16:30:00Z">
+      <w:ins w:id="52" w:author="Jonathan Urrutia" w:date="2026-05-06T16:30:00Z">
         <w:r>
           <w:rPr>
             <w:sz w:val="22"/>
@@ -939,7 +991,7 @@
         </w:rPr>
         <w:t xml:space="preserve">. </w:t>
       </w:r>
-      <w:del w:id="44" w:author="Jonathan Urrutia" w:date="2026-05-06T16:31:00Z">
+      <w:del w:id="53" w:author="Jonathan Urrutia" w:date="2026-05-06T16:31:00Z">
         <w:r>
           <w:rPr>
             <w:sz w:val="22"/>
@@ -948,7 +1000,7 @@
           <w:delText>Estos resultados permiten caracterizar cantidades macroscópicas medibles de un eritrocito sano</w:delText>
         </w:r>
       </w:del>
-      <w:ins w:id="45" w:author="Jonathan Urrutia" w:date="2026-05-06T16:31:00Z">
+      <w:ins w:id="54" w:author="Jonathan Urrutia" w:date="2026-05-06T16:31:00Z">
         <w:r>
           <w:rPr>
             <w:sz w:val="22"/>
@@ -957,7 +1009,7 @@
           <w:t xml:space="preserve">.. Este trabajo </w:t>
         </w:r>
       </w:ins>
-      <w:del w:id="46" w:author="Jonathan Urrutia" w:date="2026-05-06T16:31:00Z">
+      <w:del w:id="55" w:author="Jonathan Urrutia" w:date="2026-05-06T16:31:00Z">
         <w:r>
           <w:rPr>
             <w:sz w:val="22"/>
@@ -966,7 +1018,7 @@
           <w:delText xml:space="preserve">, proporcionando </w:delText>
         </w:r>
       </w:del>
-      <w:ins w:id="47" w:author="Jonathan Urrutia" w:date="2026-05-06T16:31:00Z">
+      <w:ins w:id="56" w:author="Jonathan Urrutia" w:date="2026-05-06T16:31:00Z">
         <w:r>
           <w:rPr>
             <w:sz w:val="22"/>
@@ -982,7 +1034,7 @@
         </w:rPr>
         <w:t xml:space="preserve">una base para </w:t>
       </w:r>
-      <w:ins w:id="48" w:author="Jonathan Urrutia" w:date="2026-05-06T16:31:00Z">
+      <w:ins w:id="57" w:author="Jonathan Urrutia" w:date="2026-05-06T16:31:00Z">
         <w:r>
           <w:rPr>
             <w:sz w:val="22"/>
@@ -1001,149 +1053,206 @@
     </w:p>
     <w:p>
       <w:pPr>
+        <w:pStyle w:val="Normal"/>
+        <w:spacing w:before="0" w:after="160"/>
         <w:jc w:val="both"/>
         <w:rPr>
           <w:sz w:val="22"/>
           <w:szCs w:val="22"/>
         </w:rPr>
       </w:pPr>
+      <w:r>
+        <w:rPr>
+          <w:sz w:val="22"/>
+          <w:szCs w:val="22"/>
+        </w:rPr>
+      </w:r>
     </w:p>
     <w:sectPr>
+      <w:type w:val="nextPage"/>
       <w:pgSz w:w="12240" w:h="15840"/>
-      <w:pgMar w:top="1417" w:right="1701" w:bottom="1417" w:left="1701" w:header="0" w:footer="0" w:gutter="0"/>
-      <w:cols w:space="720"/>
-      <w:formProt w:val="0"/>
-      <w:docGrid w:linePitch="360"/>
+      <w:pgMar w:left="1701" w:right="1701" w:gutter="0" w:header="0" w:top="1417" w:footer="0" w:bottom="1417"/>
+      <w:pgNumType w:fmt="decimal"/>
+      <w:formProt w:val="false"/>
+      <w:textDirection w:val="lrTb"/>
+      <w:docGrid w:type="default" w:linePitch="360" w:charSpace="0"/>
     </w:sectPr>
   </w:body>
 </w:document>
 </file>
 
 <file path=word/comments.xml><?xml version="1.0" encoding="utf-8"?>
-<w:comments xmlns:wpc="http://schemas.microsoft.com/office/word/2010/wordprocessingCanvas" xmlns:cx="http://schemas.microsoft.com/office/drawing/2014/chartex" xmlns:cx1="http://schemas.microsoft.com/office/drawing/2015/9/8/chartex" xmlns:cx2="http://schemas.microsoft.com/office/drawing/2015/10/21/chartex" xmlns:cx3="http://schemas.microsoft.com/office/drawing/2016/5/9/chartex" xmlns:cx4="http://schemas.microsoft.com/office/drawing/2016/5/10/chartex" xmlns:cx5="http://schemas.microsoft.com/office/drawing/2016/5/11/chartex" xmlns:cx6="http://schemas.microsoft.com/office/drawing/2016/5/12/chartex" xmlns:cx7="http://schemas.microsoft.com/office/drawing/2016/5/13/chartex" xmlns:cx8="http://schemas.microsoft.com/office/drawing/2016/5/14/chartex" xmlns:mc="http://schemas.openxmlformats.org/markup-compatibility/2006" xmlns:aink="http://schemas.microsoft.com/office/drawing/2016/ink" xmlns:am3d="http://schemas.microsoft.com/office/drawing/2017/model3d" xmlns:o="urn:schemas-microsoft-com:office:office" xmlns:oel="http://schemas.microsoft.com/office/2019/extlst" xmlns:r="http://schemas.openxmlformats.org/officeDocument/2006/relationships" xmlns:m="http://schemas.openxmlformats.org/officeDocument/2006/math" xmlns:v="urn:schemas-microsoft-com:vml" xmlns:wp14="http://schemas.microsoft.com/office/word/2010/wordprocessingDrawing" xmlns:wp="http://schemas.openxmlformats.org/drawingml/2006/wordprocessingDrawing" xmlns:w10="urn:schemas-microsoft-com:office:word" xmlns:w="http://schemas.openxmlformats.org/wordprocessingml/2006/main" xmlns:w14="http://schemas.microsoft.com/office/word/2010/wordml" xmlns:w15="http://schemas.microsoft.com/office/word/2012/wordml" xmlns:w16cex="http://schemas.microsoft.com/office/word/2018/wordml/cex" xmlns:w16cid="http://schemas.microsoft.com/office/word/2016/wordml/cid" xmlns:w16="http://schemas.microsoft.com/office/word/2018/wordml" xmlns:w16du="http://schemas.microsoft.com/office/word/2023/wordml/word16du" xmlns:w16sdtdh="http://schemas.microsoft.com/office/word/2020/wordml/sdtdatahash" xmlns:w16sdtfl="http://schemas.microsoft.com/office/word/2024/wordml/sdtformatlock" xmlns:w16se="http://schemas.microsoft.com/office/word/2015/wordml/symex" xmlns:wpg="http://schemas.microsoft.com/office/word/2010/wordprocessingGroup" xmlns:wpi="http://schemas.microsoft.com/office/word/2010/wordprocessingInk" xmlns:wne="http://schemas.microsoft.com/office/word/2006/wordml" xmlns:wps="http://schemas.microsoft.com/office/word/2010/wordprocessingShape" mc:Ignorable="w14 w15 w16se w16cid w16 w16cex w16sdtdh w16sdtfl w16du wp14">
-  <w:comment w:id="0" w:author="Jonathan Urrutia" w:date="2026-05-06T16:23:00Z" w:initials="JU">
-    <w:p>
-      <w:pPr>
-        <w:spacing w:after="0" w:line="240" w:lineRule="auto"/>
+<w:comments xmlns:o="urn:schemas-microsoft-com:office:office" xmlns:r="http://schemas.openxmlformats.org/officeDocument/2006/relationships" xmlns:v="urn:schemas-microsoft-com:vml" xmlns:w="http://schemas.openxmlformats.org/wordprocessingml/2006/main" xmlns:w10="urn:schemas-microsoft-com:office:word" xmlns:wp="http://schemas.openxmlformats.org/drawingml/2006/wordprocessingDrawing" xmlns:pic="http://schemas.openxmlformats.org/drawingml/2006/picture" xmlns:wps="http://schemas.microsoft.com/office/word/2010/wordprocessingShape" xmlns:wpg="http://schemas.microsoft.com/office/word/2010/wordprocessingGroup" xmlns:mc="http://schemas.openxmlformats.org/markup-compatibility/2006" xmlns:wp14="http://schemas.microsoft.com/office/word/2010/wordprocessingDrawing" xmlns:w14="http://schemas.microsoft.com/office/word/2010/wordml" xmlns:w15="http://schemas.microsoft.com/office/word/2012/wordml" mc:Ignorable="w14 wp14 w15">
+  <w:comment w:id="1" w:author="Jonathan Urrutia" w:date="2026-05-06T16:23:00Z" w:initials="JU">
+    <w:p>
+      <w:pPr>
+        <w:overflowPunct w:val="false"/>
+        <w:spacing w:before="0" w:after="0" w:lineRule="auto" w:line="240"/>
+        <w:rPr/>
       </w:pPr>
       <w:r>
         <w:annotationRef/>
       </w:r>
       <w:r>
         <w:rPr>
-          <w:rFonts w:ascii="Liberation Serif" w:eastAsia="DejaVu Sans" w:hAnsi="Liberation Serif" w:cs="DejaVu Sans"/>
+          <w:rFonts w:eastAsia="DejaVu Sans" w:cs="DejaVu Sans" w:ascii="Liberation Serif" w:hAnsi="Liberation Serif"/>
           <w:kern w:val="0"/>
-          <w:lang w:val="en-US" w:bidi="en-US"/>
+          <w:lang w:eastAsia="en-US" w:val="en-US" w:bidi="en-US"/>
         </w:rPr>
         <w:t>Qué tal algo como:</w:t>
       </w:r>
     </w:p>
     <w:p>
       <w:pPr>
-        <w:spacing w:after="0" w:line="240" w:lineRule="auto"/>
-      </w:pPr>
-      <w:r>
-        <w:rPr>
-          <w:rFonts w:ascii="Liberation Serif" w:eastAsia="DejaVu Sans" w:hAnsi="Liberation Serif" w:cs="DejaVu Sans"/>
+        <w:overflowPunct w:val="false"/>
+        <w:spacing w:before="0" w:after="0" w:lineRule="auto" w:line="240"/>
+        <w:rPr/>
+      </w:pPr>
+      <w:r>
+        <w:rPr>
+          <w:rFonts w:eastAsia="DejaVu Sans" w:cs="DejaVu Sans" w:ascii="Liberation Serif" w:hAnsi="Liberation Serif"/>
           <w:kern w:val="0"/>
-          <w:lang w:val="en-US" w:bidi="en-US"/>
+          <w:lang w:eastAsia="en-US" w:val="en-US" w:bidi="en-US"/>
         </w:rPr>
         <w:t>Propiedades ópticas de eritrositos en el campo lejano: enfoque numérico</w:t>
       </w:r>
     </w:p>
     <w:p>
       <w:pPr>
-        <w:spacing w:after="0" w:line="240" w:lineRule="auto"/>
-      </w:pPr>
-    </w:p>
-    <w:p>
-      <w:pPr>
-        <w:spacing w:after="0" w:line="240" w:lineRule="auto"/>
-      </w:pPr>
-      <w:r>
-        <w:rPr>
-          <w:rFonts w:ascii="Liberation Serif" w:eastAsia="DejaVu Sans" w:hAnsi="Liberation Serif" w:cs="DejaVu Sans"/>
+        <w:overflowPunct w:val="false"/>
+        <w:spacing w:before="0" w:after="0" w:lineRule="auto" w:line="240"/>
+        <w:rPr/>
+      </w:pPr>
+      <w:r>
+        <w:rPr>
+          <w:rFonts w:cs="DejaVu Sans" w:ascii="Liberation Serif" w:hAnsi="Liberation Serif" w:eastAsia="DejaVu Sans"/>
           <w:kern w:val="0"/>
-          <w:lang w:val="en-US" w:bidi="en-US"/>
+          <w:lang w:bidi="en-US" w:val="en-US" w:eastAsia="en-US"/>
+        </w:rPr>
+      </w:r>
+    </w:p>
+    <w:p>
+      <w:pPr>
+        <w:overflowPunct w:val="false"/>
+        <w:spacing w:before="0" w:after="0" w:lineRule="auto" w:line="240"/>
+        <w:rPr/>
+      </w:pPr>
+      <w:r>
+        <w:rPr>
+          <w:rFonts w:eastAsia="DejaVu Sans" w:cs="DejaVu Sans" w:ascii="Liberation Serif" w:hAnsi="Liberation Serif"/>
+          <w:kern w:val="0"/>
+          <w:lang w:eastAsia="en-US" w:val="en-US" w:bidi="en-US"/>
         </w:rPr>
         <w:t>Yo resaltaría que es numéico y es campo lejano. También optiaría por lo que caracterizas la céluila</w:t>
       </w:r>
     </w:p>
     <w:p>
       <w:pPr>
-        <w:spacing w:after="0" w:line="240" w:lineRule="auto"/>
-      </w:pPr>
-    </w:p>
-    <w:p>
-      <w:pPr>
-        <w:spacing w:after="0" w:line="240" w:lineRule="auto"/>
-      </w:pPr>
-      <w:r>
-        <w:rPr>
-          <w:rFonts w:ascii="Liberation Serif" w:eastAsia="DejaVu Sans" w:hAnsi="Liberation Serif" w:cs="DejaVu Sans"/>
+        <w:overflowPunct w:val="false"/>
+        <w:spacing w:before="0" w:after="0" w:lineRule="auto" w:line="240"/>
+        <w:rPr/>
+      </w:pPr>
+      <w:r>
+        <w:rPr>
+          <w:rFonts w:cs="DejaVu Sans" w:ascii="Liberation Serif" w:hAnsi="Liberation Serif" w:eastAsia="DejaVu Sans"/>
           <w:kern w:val="0"/>
-          <w:lang w:val="en-US" w:bidi="en-US"/>
+          <w:lang w:bidi="en-US" w:val="en-US" w:eastAsia="en-US"/>
+        </w:rPr>
+      </w:r>
+    </w:p>
+    <w:p>
+      <w:pPr>
+        <w:overflowPunct w:val="false"/>
+        <w:spacing w:before="0" w:after="0" w:lineRule="auto" w:line="240"/>
+        <w:rPr/>
+      </w:pPr>
+      <w:r>
+        <w:rPr>
+          <w:rFonts w:eastAsia="DejaVu Sans" w:cs="DejaVu Sans" w:ascii="Liberation Serif" w:hAnsi="Liberation Serif"/>
+          <w:kern w:val="0"/>
+          <w:lang w:eastAsia="en-US" w:val="en-US" w:bidi="en-US"/>
         </w:rPr>
         <w:t xml:space="preserve">Caracterización óptica de eritrositos en el campo lejano </w:t>
       </w:r>
     </w:p>
     <w:p>
       <w:pPr>
-        <w:spacing w:after="0" w:line="240" w:lineRule="auto"/>
-      </w:pPr>
-    </w:p>
-    <w:p>
-      <w:pPr>
-        <w:spacing w:after="0" w:line="240" w:lineRule="auto"/>
-      </w:pPr>
-      <w:r>
-        <w:rPr>
-          <w:rFonts w:ascii="Liberation Serif" w:eastAsia="DejaVu Sans" w:hAnsi="Liberation Serif" w:cs="DejaVu Sans"/>
+        <w:overflowPunct w:val="false"/>
+        <w:spacing w:before="0" w:after="0" w:lineRule="auto" w:line="240"/>
+        <w:rPr/>
+      </w:pPr>
+      <w:r>
+        <w:rPr>
+          <w:rFonts w:cs="DejaVu Sans" w:ascii="Liberation Serif" w:hAnsi="Liberation Serif" w:eastAsia="DejaVu Sans"/>
           <w:kern w:val="0"/>
-          <w:lang w:val="en-US" w:bidi="en-US"/>
+          <w:lang w:bidi="en-US" w:val="en-US" w:eastAsia="en-US"/>
+        </w:rPr>
+      </w:r>
+    </w:p>
+    <w:p>
+      <w:pPr>
+        <w:overflowPunct w:val="false"/>
+        <w:spacing w:before="0" w:after="0" w:lineRule="auto" w:line="240"/>
+        <w:rPr/>
+      </w:pPr>
+      <w:r>
+        <w:rPr>
+          <w:rFonts w:eastAsia="DejaVu Sans" w:cs="DejaVu Sans" w:ascii="Liberation Serif" w:hAnsi="Liberation Serif"/>
+          <w:kern w:val="0"/>
+          <w:lang w:eastAsia="en-US" w:val="en-US" w:bidi="en-US"/>
         </w:rPr>
         <w:t>Algo así</w:t>
       </w:r>
     </w:p>
   </w:comment>
-  <w:comment w:id="1" w:author="Jonathan Urrutia" w:date="2026-05-07T12:23:00Z" w:initials="JU">
-    <w:p>
-      <w:pPr>
-        <w:overflowPunct w:val="0"/>
-        <w:spacing w:after="0" w:line="240" w:lineRule="auto"/>
+  <w:comment w:id="0" w:author="Jonathan Urrutia" w:date="2026-05-07T12:23:00Z" w:initials="JU">
+    <w:p>
+      <w:pPr>
+        <w:overflowPunct w:val="true"/>
+        <w:spacing w:lineRule="auto" w:line="240" w:before="0" w:after="0"/>
+        <w:rPr/>
       </w:pPr>
       <w:r>
         <w:annotationRef/>
       </w:r>
       <w:r>
         <w:rPr>
-          <w:rFonts w:ascii="Liberation Serif" w:eastAsia="DejaVu Sans" w:hAnsi="Liberation Serif" w:cs="DejaVu Sans"/>
+          <w:rFonts w:eastAsia="DejaVu Sans" w:cs="DejaVu Sans" w:ascii="Liberation Serif" w:hAnsi="Liberation Serif"/>
           <w:i/>
           <w:kern w:val="0"/>
           <w:sz w:val="16"/>
-          <w:lang w:val="en-US" w:bidi="en-US"/>
+          <w:lang w:eastAsia="en-US" w:val="en-US" w:bidi="en-US"/>
         </w:rPr>
         <w:t xml:space="preserve">Creo que caracterización da la impresión de que es algo xperimetnal entonces a lo mejor no es buena idea ponerlo. </w:t>
       </w:r>
     </w:p>
     <w:p>
       <w:pPr>
-        <w:overflowPunct w:val="0"/>
-        <w:spacing w:after="0" w:line="240" w:lineRule="auto"/>
-      </w:pPr>
-    </w:p>
-    <w:p>
-      <w:pPr>
-        <w:overflowPunct w:val="0"/>
-        <w:spacing w:after="0" w:line="240" w:lineRule="auto"/>
-      </w:pPr>
-      <w:r>
-        <w:rPr>
-          <w:rFonts w:ascii="Liberation Serif" w:eastAsia="DejaVu Sans" w:hAnsi="Liberation Serif" w:cs="DejaVu Sans"/>
+        <w:overflowPunct w:val="true"/>
+        <w:spacing w:lineRule="auto" w:line="240" w:before="0" w:after="0"/>
+        <w:rPr/>
+      </w:pPr>
+      <w:r>
+        <w:rPr>
+          <w:rFonts w:cs="DejaVu Sans" w:ascii="Liberation Serif" w:hAnsi="Liberation Serif" w:eastAsia="DejaVu Sans"/>
+          <w:kern w:val="0"/>
+          <w:lang w:bidi="en-US" w:val="en-US" w:eastAsia="en-US"/>
+        </w:rPr>
+      </w:r>
+    </w:p>
+    <w:p>
+      <w:pPr>
+        <w:overflowPunct w:val="true"/>
+        <w:spacing w:lineRule="auto" w:line="240" w:before="0" w:after="0"/>
+        <w:rPr/>
+      </w:pPr>
+      <w:r>
+        <w:rPr>
+          <w:rFonts w:eastAsia="DejaVu Sans" w:cs="DejaVu Sans" w:ascii="Liberation Serif" w:hAnsi="Liberation Serif"/>
           <w:i/>
           <w:kern w:val="0"/>
           <w:sz w:val="16"/>
-          <w:lang w:val="en-US" w:bidi="en-US"/>
+          <w:lang w:eastAsia="en-US" w:val="en-US" w:bidi="en-US"/>
         </w:rPr>
         <w:t xml:space="preserve">Los títulos no son lo mío entnces ay que darle vueltas. </w:t>
       </w:r>
@@ -1152,56 +1261,67 @@
   <w:comment w:id="2" w:author="Jonathan Urrutia" w:date="2026-05-07T12:20:00Z" w:initials="JU">
     <w:p>
       <w:pPr>
-        <w:overflowPunct w:val="0"/>
-        <w:spacing w:after="0" w:line="240" w:lineRule="auto"/>
+        <w:overflowPunct w:val="true"/>
+        <w:spacing w:lineRule="auto" w:line="240" w:before="0" w:after="0"/>
+        <w:rPr/>
       </w:pPr>
       <w:r>
         <w:annotationRef/>
       </w:r>
       <w:r>
         <w:rPr>
-          <w:rFonts w:ascii="Liberation Serif" w:eastAsia="DejaVu Sans" w:hAnsi="Liberation Serif" w:cs="DejaVu Sans"/>
+          <w:rFonts w:eastAsia="DejaVu Sans" w:cs="DejaVu Sans" w:ascii="Liberation Serif" w:hAnsi="Liberation Serif"/>
           <w:kern w:val="0"/>
-          <w:lang w:val="en-US" w:bidi="en-US"/>
+          <w:lang w:eastAsia="en-US" w:val="en-US" w:bidi="en-US"/>
         </w:rPr>
         <w:t>Pelón propone</w:t>
       </w:r>
     </w:p>
     <w:p>
       <w:pPr>
-        <w:overflowPunct w:val="0"/>
-        <w:spacing w:after="0" w:line="240" w:lineRule="auto"/>
-      </w:pPr>
-      <w:r>
-        <w:rPr>
-          <w:rFonts w:ascii="Liberation Serif" w:eastAsia="DejaVu Sans" w:hAnsi="Liberation Serif" w:cs="DejaVu Sans"/>
+        <w:overflowPunct w:val="true"/>
+        <w:spacing w:lineRule="auto" w:line="240" w:before="0" w:after="0"/>
+        <w:rPr/>
+      </w:pPr>
+      <w:r>
+        <w:rPr>
+          <w:rFonts w:eastAsia="DejaVu Sans" w:cs="DejaVu Sans" w:ascii="Liberation Serif" w:hAnsi="Liberation Serif"/>
           <w:kern w:val="0"/>
-          <w:lang w:val="en-US" w:bidi="en-US"/>
+          <w:lang w:eastAsia="en-US" w:val="en-US" w:bidi="en-US"/>
         </w:rPr>
         <w:t>Caracterización íptica de eritrocitos mediante FIT en e régimen del campo lejano</w:t>
       </w:r>
     </w:p>
     <w:p>
       <w:pPr>
-        <w:overflowPunct w:val="0"/>
-        <w:spacing w:after="0" w:line="240" w:lineRule="auto"/>
-      </w:pPr>
+        <w:overflowPunct w:val="true"/>
+        <w:spacing w:lineRule="auto" w:line="240" w:before="0" w:after="0"/>
+        <w:rPr/>
+      </w:pPr>
+      <w:r>
+        <w:rPr>
+          <w:rFonts w:cs="DejaVu Sans" w:ascii="Liberation Serif" w:hAnsi="Liberation Serif" w:eastAsia="DejaVu Sans"/>
+          <w:kern w:val="0"/>
+          <w:lang w:bidi="en-US" w:val="en-US" w:eastAsia="en-US"/>
+        </w:rPr>
+      </w:r>
     </w:p>
   </w:comment>
-  <w:comment w:id="34" w:author="Jonathan Urrutia" w:date="2026-05-07T12:12:00Z" w:initials="JU">
-    <w:p>
-      <w:pPr>
-        <w:overflowPunct w:val="0"/>
-        <w:spacing w:after="0" w:line="240" w:lineRule="auto"/>
+  <w:comment w:id="3" w:author="Jonathan Urrutia" w:date="2026-05-07T12:12:00Z" w:initials="JU">
+    <w:p>
+      <w:pPr>
+        <w:overflowPunct w:val="true"/>
+        <w:spacing w:lineRule="auto" w:line="240" w:before="0" w:after="0"/>
+        <w:rPr/>
       </w:pPr>
       <w:r>
         <w:annotationRef/>
       </w:r>
       <w:r>
         <w:rPr>
-          <w:rFonts w:ascii="Liberation Serif" w:eastAsia="DejaVu Sans" w:hAnsi="Liberation Serif" w:cs="DejaVu Sans"/>
+          <w:rFonts w:eastAsia="DejaVu Sans" w:cs="DejaVu Sans" w:ascii="Liberation Serif" w:hAnsi="Liberation Serif"/>
           <w:kern w:val="0"/>
-          <w:lang w:val="en-US" w:bidi="en-US"/>
+          <w:lang w:eastAsia="en-US" w:val="en-US" w:bidi="en-US"/>
         </w:rPr>
         <w:t>Creo que sería conveniente inlcuir que es relavante para el médoto numérico y/o decir que mejoras ajustees previamente reportados.</w:t>
       </w:r>
@@ -1211,37 +1331,17 @@
 </file>
 
 <file path=word/commentsExtended.xml><?xml version="1.0" encoding="utf-8"?>
-<w15:commentsEx xmlns:wpc="http://schemas.microsoft.com/office/word/2010/wordprocessingCanvas" xmlns:cx="http://schemas.microsoft.com/office/drawing/2014/chartex" xmlns:cx1="http://schemas.microsoft.com/office/drawing/2015/9/8/chartex" xmlns:cx2="http://schemas.microsoft.com/office/drawing/2015/10/21/chartex" xmlns:cx3="http://schemas.microsoft.com/office/drawing/2016/5/9/chartex" xmlns:cx4="http://schemas.microsoft.com/office/drawing/2016/5/10/chartex" xmlns:cx5="http://schemas.microsoft.com/office/drawing/2016/5/11/chartex" xmlns:cx6="http://schemas.microsoft.com/office/drawing/2016/5/12/chartex" xmlns:cx7="http://schemas.microsoft.com/office/drawing/2016/5/13/chartex" xmlns:cx8="http://schemas.microsoft.com/office/drawing/2016/5/14/chartex" xmlns:mc="http://schemas.openxmlformats.org/markup-compatibility/2006" xmlns:aink="http://schemas.microsoft.com/office/drawing/2016/ink" xmlns:am3d="http://schemas.microsoft.com/office/drawing/2017/model3d" xmlns:o="urn:schemas-microsoft-com:office:office" xmlns:oel="http://schemas.microsoft.com/office/2019/extlst" xmlns:r="http://schemas.openxmlformats.org/officeDocument/2006/relationships" xmlns:m="http://schemas.openxmlformats.org/officeDocument/2006/math" xmlns:v="urn:schemas-microsoft-com:vml" xmlns:wp14="http://schemas.microsoft.com/office/word/2010/wordprocessingDrawing" xmlns:wp="http://schemas.openxmlformats.org/drawingml/2006/wordprocessingDrawing" xmlns:w10="urn:schemas-microsoft-com:office:word" xmlns:w="http://schemas.openxmlformats.org/wordprocessingml/2006/main" xmlns:w14="http://schemas.microsoft.com/office/word/2010/wordml" xmlns:w15="http://schemas.microsoft.com/office/word/2012/wordml" xmlns:w16cex="http://schemas.microsoft.com/office/word/2018/wordml/cex" xmlns:w16cid="http://schemas.microsoft.com/office/word/2016/wordml/cid" xmlns:w16="http://schemas.microsoft.com/office/word/2018/wordml" xmlns:w16du="http://schemas.microsoft.com/office/word/2023/wordml/word16du" xmlns:w16sdtdh="http://schemas.microsoft.com/office/word/2020/wordml/sdtdatahash" xmlns:w16sdtfl="http://schemas.microsoft.com/office/word/2024/wordml/sdtformatlock" xmlns:w16se="http://schemas.microsoft.com/office/word/2015/wordml/symex" xmlns:wpg="http://schemas.microsoft.com/office/word/2010/wordprocessingGroup" xmlns:wpi="http://schemas.microsoft.com/office/word/2010/wordprocessingInk" xmlns:wne="http://schemas.microsoft.com/office/word/2006/wordml" xmlns:wps="http://schemas.microsoft.com/office/word/2010/wordprocessingShape" mc:Ignorable="w14 w15 w16se w16cid w16 w16cex w16sdtdh w16sdtfl w16du wp14">
-  <w15:commentEx w15:paraId="01000000" w15:done="0"/>
-  <w15:commentEx w15:paraId="02000000" w15:paraIdParent="01000000" w15:done="0"/>
-  <w15:commentEx w15:paraId="48C6B446" w15:done="0"/>
-  <w15:commentEx w15:paraId="09FEAED6" w15:done="0"/>
+<w15:commentsEx xmlns:mc="http://schemas.openxmlformats.org/markup-compatibility/2006" xmlns:w15="http://schemas.microsoft.com/office/word/2012/wordml" mc:Ignorable="w15">
+  <w15:commentEx w15:paraId="02000000" w15:paraIdParent="01000000"/>
 </w15:commentsEx>
 </file>
 
-<file path=word/commentsIds.xml><?xml version="1.0" encoding="utf-8"?>
-<w16cid:commentsIds xmlns:wpc="http://schemas.microsoft.com/office/word/2010/wordprocessingCanvas" xmlns:cx="http://schemas.microsoft.com/office/drawing/2014/chartex" xmlns:cx1="http://schemas.microsoft.com/office/drawing/2015/9/8/chartex" xmlns:cx2="http://schemas.microsoft.com/office/drawing/2015/10/21/chartex" xmlns:cx3="http://schemas.microsoft.com/office/drawing/2016/5/9/chartex" xmlns:cx4="http://schemas.microsoft.com/office/drawing/2016/5/10/chartex" xmlns:cx5="http://schemas.microsoft.com/office/drawing/2016/5/11/chartex" xmlns:cx6="http://schemas.microsoft.com/office/drawing/2016/5/12/chartex" xmlns:cx7="http://schemas.microsoft.com/office/drawing/2016/5/13/chartex" xmlns:cx8="http://schemas.microsoft.com/office/drawing/2016/5/14/chartex" xmlns:mc="http://schemas.openxmlformats.org/markup-compatibility/2006" xmlns:aink="http://schemas.microsoft.com/office/drawing/2016/ink" xmlns:am3d="http://schemas.microsoft.com/office/drawing/2017/model3d" xmlns:o="urn:schemas-microsoft-com:office:office" xmlns:oel="http://schemas.microsoft.com/office/2019/extlst" xmlns:r="http://schemas.openxmlformats.org/officeDocument/2006/relationships" xmlns:m="http://schemas.openxmlformats.org/officeDocument/2006/math" xmlns:v="urn:schemas-microsoft-com:vml" xmlns:wp14="http://schemas.microsoft.com/office/word/2010/wordprocessingDrawing" xmlns:wp="http://schemas.openxmlformats.org/drawingml/2006/wordprocessingDrawing" xmlns:w10="urn:schemas-microsoft-com:office:word" xmlns:w="http://schemas.openxmlformats.org/wordprocessingml/2006/main" xmlns:w14="http://schemas.microsoft.com/office/word/2010/wordml" xmlns:w15="http://schemas.microsoft.com/office/word/2012/wordml" xmlns:w16cex="http://schemas.microsoft.com/office/word/2018/wordml/cex" xmlns:w16cid="http://schemas.microsoft.com/office/word/2016/wordml/cid" xmlns:w16="http://schemas.microsoft.com/office/word/2018/wordml" xmlns:w16du="http://schemas.microsoft.com/office/word/2023/wordml/word16du" xmlns:w16sdtdh="http://schemas.microsoft.com/office/word/2020/wordml/sdtdatahash" xmlns:w16sdtfl="http://schemas.microsoft.com/office/word/2024/wordml/sdtformatlock" xmlns:w16se="http://schemas.microsoft.com/office/word/2015/wordml/symex" xmlns:wpg="http://schemas.microsoft.com/office/word/2010/wordprocessingGroup" xmlns:wpi="http://schemas.microsoft.com/office/word/2010/wordprocessingInk" xmlns:wne="http://schemas.microsoft.com/office/word/2006/wordml" xmlns:wps="http://schemas.microsoft.com/office/word/2010/wordprocessingShape" mc:Ignorable="w14 w15 w16se w16cid w16 w16cex w16sdtdh w16sdtfl w16du wp14">
-  <w16cid:commentId w16cid:paraId="01000000" w16cid:durableId="01000000"/>
-  <w16cid:commentId w16cid:paraId="02000000" w16cid:durableId="02000000"/>
-  <w16cid:commentId w16cid:paraId="48C6B446" w16cid:durableId="48C6B446"/>
-  <w16cid:commentId w16cid:paraId="09FEAED6" w16cid:durableId="09FEAED6"/>
-</w16cid:commentsIds>
-</file>
-
-<file path=word/people.xml><?xml version="1.0" encoding="utf-8"?>
-<w15:people xmlns:wpc="http://schemas.microsoft.com/office/word/2010/wordprocessingCanvas" xmlns:cx="http://schemas.microsoft.com/office/drawing/2014/chartex" xmlns:cx1="http://schemas.microsoft.com/office/drawing/2015/9/8/chartex" xmlns:cx2="http://schemas.microsoft.com/office/drawing/2015/10/21/chartex" xmlns:cx3="http://schemas.microsoft.com/office/drawing/2016/5/9/chartex" xmlns:cx4="http://schemas.microsoft.com/office/drawing/2016/5/10/chartex" xmlns:cx5="http://schemas.microsoft.com/office/drawing/2016/5/11/chartex" xmlns:cx6="http://schemas.microsoft.com/office/drawing/2016/5/12/chartex" xmlns:cx7="http://schemas.microsoft.com/office/drawing/2016/5/13/chartex" xmlns:cx8="http://schemas.microsoft.com/office/drawing/2016/5/14/chartex" xmlns:mc="http://schemas.openxmlformats.org/markup-compatibility/2006" xmlns:aink="http://schemas.microsoft.com/office/drawing/2016/ink" xmlns:am3d="http://schemas.microsoft.com/office/drawing/2017/model3d" xmlns:o="urn:schemas-microsoft-com:office:office" xmlns:oel="http://schemas.microsoft.com/office/2019/extlst" xmlns:r="http://schemas.openxmlformats.org/officeDocument/2006/relationships" xmlns:m="http://schemas.openxmlformats.org/officeDocument/2006/math" xmlns:v="urn:schemas-microsoft-com:vml" xmlns:wp14="http://schemas.microsoft.com/office/word/2010/wordprocessingDrawing" xmlns:wp="http://schemas.openxmlformats.org/drawingml/2006/wordprocessingDrawing" xmlns:w10="urn:schemas-microsoft-com:office:word" xmlns:w="http://schemas.openxmlformats.org/wordprocessingml/2006/main" xmlns:w14="http://schemas.microsoft.com/office/word/2010/wordml" xmlns:w15="http://schemas.microsoft.com/office/word/2012/wordml" xmlns:w16cex="http://schemas.microsoft.com/office/word/2018/wordml/cex" xmlns:w16cid="http://schemas.microsoft.com/office/word/2016/wordml/cid" xmlns:w16="http://schemas.microsoft.com/office/word/2018/wordml" xmlns:w16du="http://schemas.microsoft.com/office/word/2023/wordml/word16du" xmlns:w16sdtdh="http://schemas.microsoft.com/office/word/2020/wordml/sdtdatahash" xmlns:w16sdtfl="http://schemas.microsoft.com/office/word/2024/wordml/sdtformatlock" xmlns:w16se="http://schemas.microsoft.com/office/word/2015/wordml/symex" xmlns:wpg="http://schemas.microsoft.com/office/word/2010/wordprocessingGroup" xmlns:wpi="http://schemas.microsoft.com/office/word/2010/wordprocessingInk" xmlns:wne="http://schemas.microsoft.com/office/word/2006/wordml" xmlns:wps="http://schemas.microsoft.com/office/word/2010/wordprocessingShape" mc:Ignorable="w14 w15 w16se w16cid w16 w16cex w16sdtdh w16sdtfl w16du wp14">
-  <w15:person w15:author="DANA LARISSA LUNA GONZALEZ">
-    <w15:presenceInfo w15:providerId="AD" w15:userId="S::dana.larissalg@comunidad.unam.mx::39843a73-9849-4286-a8ca-08e07cb4b281"/>
-  </w15:person>
-</w15:people>
-</file>
-
 <file path=word/styles.xml><?xml version="1.0" encoding="utf-8"?>
-<w:styles xmlns:mc="http://schemas.openxmlformats.org/markup-compatibility/2006" xmlns:r="http://schemas.openxmlformats.org/officeDocument/2006/relationships" xmlns:w="http://schemas.openxmlformats.org/wordprocessingml/2006/main" xmlns:w14="http://schemas.microsoft.com/office/word/2010/wordml" xmlns:w15="http://schemas.microsoft.com/office/word/2012/wordml" xmlns:w16cex="http://schemas.microsoft.com/office/word/2018/wordml/cex" xmlns:w16cid="http://schemas.microsoft.com/office/word/2016/wordml/cid" xmlns:w16="http://schemas.microsoft.com/office/word/2018/wordml" xmlns:w16du="http://schemas.microsoft.com/office/word/2023/wordml/word16du" xmlns:w16sdtdh="http://schemas.microsoft.com/office/word/2020/wordml/sdtdatahash" xmlns:w16sdtfl="http://schemas.microsoft.com/office/word/2024/wordml/sdtformatlock" xmlns:w16se="http://schemas.microsoft.com/office/word/2015/wordml/symex" mc:Ignorable="w14 w15 w16se w16cid w16 w16cex w16sdtdh w16sdtfl w16du">
+<w:styles xmlns:w="http://schemas.openxmlformats.org/wordprocessingml/2006/main" xmlns:w14="http://schemas.microsoft.com/office/word/2010/wordml" xmlns:mc="http://schemas.openxmlformats.org/markup-compatibility/2006" mc:Ignorable="w14">
   <w:docDefaults>
     <w:rPrDefault>
       <w:rPr>
-        <w:rFonts w:asciiTheme="minorHAnsi" w:eastAsiaTheme="minorHAnsi" w:hAnsiTheme="minorHAnsi" w:cstheme="minorBidi"/>
+        <w:rFonts w:ascii="Aptos" w:hAnsi="Aptos" w:eastAsia="Aptos" w:cs="" w:asciiTheme="minorHAnsi" w:cstheme="minorBidi" w:eastAsiaTheme="minorHAnsi" w:hAnsiTheme="minorHAnsi"/>
         <w:kern w:val="2"/>
         <w:sz w:val="24"/>
         <w:szCs w:val="24"/>
@@ -1251,21 +1351,21 @@
     </w:rPrDefault>
     <w:pPrDefault>
       <w:pPr>
-        <w:suppressAutoHyphens/>
+        <w:suppressAutoHyphens w:val="true"/>
       </w:pPr>
     </w:pPrDefault>
   </w:docDefaults>
   <w:latentStyles w:defLockedState="0" w:defUIPriority="99" w:defSemiHidden="0" w:defUnhideWhenUsed="0" w:defQFormat="0" w:count="376">
     <w:lsdException w:name="Normal" w:uiPriority="0" w:qFormat="1"/>
     <w:lsdException w:name="heading 1" w:uiPriority="9" w:qFormat="1"/>
-    <w:lsdException w:name="heading 2" w:semiHidden="1" w:uiPriority="9" w:unhideWhenUsed="1" w:qFormat="1"/>
-    <w:lsdException w:name="heading 3" w:semiHidden="1" w:uiPriority="9" w:unhideWhenUsed="1" w:qFormat="1"/>
-    <w:lsdException w:name="heading 4" w:semiHidden="1" w:uiPriority="9" w:unhideWhenUsed="1" w:qFormat="1"/>
-    <w:lsdException w:name="heading 5" w:semiHidden="1" w:uiPriority="9" w:unhideWhenUsed="1" w:qFormat="1"/>
-    <w:lsdException w:name="heading 6" w:semiHidden="1" w:uiPriority="9" w:unhideWhenUsed="1" w:qFormat="1"/>
-    <w:lsdException w:name="heading 7" w:semiHidden="1" w:uiPriority="9" w:unhideWhenUsed="1" w:qFormat="1"/>
-    <w:lsdException w:name="heading 8" w:semiHidden="1" w:uiPriority="9" w:unhideWhenUsed="1" w:qFormat="1"/>
-    <w:lsdException w:name="heading 9" w:semiHidden="1" w:uiPriority="9" w:unhideWhenUsed="1" w:qFormat="1"/>
+    <w:lsdException w:name="heading 2" w:uiPriority="9" w:semiHidden="1" w:unhideWhenUsed="1" w:qFormat="1"/>
+    <w:lsdException w:name="heading 3" w:uiPriority="9" w:semiHidden="1" w:unhideWhenUsed="1" w:qFormat="1"/>
+    <w:lsdException w:name="heading 4" w:uiPriority="9" w:semiHidden="1" w:unhideWhenUsed="1" w:qFormat="1"/>
+    <w:lsdException w:name="heading 5" w:uiPriority="9" w:semiHidden="1" w:unhideWhenUsed="1" w:qFormat="1"/>
+    <w:lsdException w:name="heading 6" w:uiPriority="9" w:semiHidden="1" w:unhideWhenUsed="1" w:qFormat="1"/>
+    <w:lsdException w:name="heading 7" w:uiPriority="9" w:semiHidden="1" w:unhideWhenUsed="1" w:qFormat="1"/>
+    <w:lsdException w:name="heading 8" w:uiPriority="9" w:semiHidden="1" w:unhideWhenUsed="1" w:qFormat="1"/>
+    <w:lsdException w:name="heading 9" w:uiPriority="9" w:semiHidden="1" w:unhideWhenUsed="1" w:qFormat="1"/>
     <w:lsdException w:name="index 1" w:semiHidden="1" w:unhideWhenUsed="1"/>
     <w:lsdException w:name="index 2" w:semiHidden="1" w:unhideWhenUsed="1"/>
     <w:lsdException w:name="index 3" w:semiHidden="1" w:unhideWhenUsed="1"/>
@@ -1275,22 +1375,22 @@
     <w:lsdException w:name="index 7" w:semiHidden="1" w:unhideWhenUsed="1"/>
     <w:lsdException w:name="index 8" w:semiHidden="1" w:unhideWhenUsed="1"/>
     <w:lsdException w:name="index 9" w:semiHidden="1" w:unhideWhenUsed="1"/>
-    <w:lsdException w:name="toc 1" w:semiHidden="1" w:uiPriority="39" w:unhideWhenUsed="1"/>
-    <w:lsdException w:name="toc 2" w:semiHidden="1" w:uiPriority="39" w:unhideWhenUsed="1"/>
-    <w:lsdException w:name="toc 3" w:semiHidden="1" w:uiPriority="39" w:unhideWhenUsed="1"/>
-    <w:lsdException w:name="toc 4" w:semiHidden="1" w:uiPriority="39" w:unhideWhenUsed="1"/>
-    <w:lsdException w:name="toc 5" w:semiHidden="1" w:uiPriority="39" w:unhideWhenUsed="1"/>
-    <w:lsdException w:name="toc 6" w:semiHidden="1" w:uiPriority="39" w:unhideWhenUsed="1"/>
-    <w:lsdException w:name="toc 7" w:semiHidden="1" w:uiPriority="39" w:unhideWhenUsed="1"/>
-    <w:lsdException w:name="toc 8" w:semiHidden="1" w:uiPriority="39" w:unhideWhenUsed="1"/>
-    <w:lsdException w:name="toc 9" w:semiHidden="1" w:uiPriority="39" w:unhideWhenUsed="1"/>
+    <w:lsdException w:name="toc 1" w:uiPriority="39" w:semiHidden="1" w:unhideWhenUsed="1"/>
+    <w:lsdException w:name="toc 2" w:uiPriority="39" w:semiHidden="1" w:unhideWhenUsed="1"/>
+    <w:lsdException w:name="toc 3" w:uiPriority="39" w:semiHidden="1" w:unhideWhenUsed="1"/>
+    <w:lsdException w:name="toc 4" w:uiPriority="39" w:semiHidden="1" w:unhideWhenUsed="1"/>
+    <w:lsdException w:name="toc 5" w:uiPriority="39" w:semiHidden="1" w:unhideWhenUsed="1"/>
+    <w:lsdException w:name="toc 6" w:uiPriority="39" w:semiHidden="1" w:unhideWhenUsed="1"/>
+    <w:lsdException w:name="toc 7" w:uiPriority="39" w:semiHidden="1" w:unhideWhenUsed="1"/>
+    <w:lsdException w:name="toc 8" w:uiPriority="39" w:semiHidden="1" w:unhideWhenUsed="1"/>
+    <w:lsdException w:name="toc 9" w:uiPriority="39" w:semiHidden="1" w:unhideWhenUsed="1"/>
     <w:lsdException w:name="Normal Indent" w:semiHidden="1" w:unhideWhenUsed="1"/>
     <w:lsdException w:name="footnote text" w:semiHidden="1" w:unhideWhenUsed="1"/>
     <w:lsdException w:name="annotation text" w:semiHidden="1" w:unhideWhenUsed="1"/>
     <w:lsdException w:name="header" w:semiHidden="1" w:unhideWhenUsed="1"/>
     <w:lsdException w:name="footer" w:semiHidden="1" w:unhideWhenUsed="1"/>
     <w:lsdException w:name="index heading" w:semiHidden="1" w:unhideWhenUsed="1"/>
-    <w:lsdException w:name="caption" w:semiHidden="1" w:uiPriority="35" w:unhideWhenUsed="1" w:qFormat="1"/>
+    <w:lsdException w:name="caption" w:uiPriority="35" w:semiHidden="1" w:unhideWhenUsed="1" w:qFormat="1"/>
     <w:lsdException w:name="table of figures" w:semiHidden="1" w:unhideWhenUsed="1"/>
     <w:lsdException w:name="envelope address" w:semiHidden="1" w:unhideWhenUsed="1"/>
     <w:lsdException w:name="envelope return" w:semiHidden="1" w:unhideWhenUsed="1"/>
@@ -1321,7 +1421,7 @@
     <w:lsdException w:name="Title" w:uiPriority="10" w:qFormat="1"/>
     <w:lsdException w:name="Closing" w:semiHidden="1" w:unhideWhenUsed="1"/>
     <w:lsdException w:name="Signature" w:semiHidden="1" w:unhideWhenUsed="1"/>
-    <w:lsdException w:name="Default Paragraph Font" w:semiHidden="1" w:uiPriority="1" w:unhideWhenUsed="1"/>
+    <w:lsdException w:name="Default Paragraph Font" w:uiPriority="1" w:semiHidden="1" w:unhideWhenUsed="1"/>
     <w:lsdException w:name="Body Text" w:semiHidden="1" w:unhideWhenUsed="1"/>
     <w:lsdException w:name="Body Text Indent" w:semiHidden="1" w:unhideWhenUsed="1"/>
     <w:lsdException w:name="List Continue" w:semiHidden="1" w:unhideWhenUsed="1"/>
@@ -1521,8 +1621,8 @@
     <w:lsdException w:name="Subtle Reference" w:uiPriority="31" w:qFormat="1"/>
     <w:lsdException w:name="Intense Reference" w:uiPriority="32" w:qFormat="1"/>
     <w:lsdException w:name="Book Title" w:uiPriority="33" w:qFormat="1"/>
-    <w:lsdException w:name="Bibliography" w:semiHidden="1" w:uiPriority="37" w:unhideWhenUsed="1"/>
-    <w:lsdException w:name="TOC Heading" w:semiHidden="1" w:uiPriority="39" w:unhideWhenUsed="1" w:qFormat="1"/>
+    <w:lsdException w:name="Bibliography" w:uiPriority="37" w:semiHidden="1" w:unhideWhenUsed="1"/>
+    <w:lsdException w:name="TOC Heading" w:uiPriority="39" w:semiHidden="1" w:unhideWhenUsed="1" w:qFormat="1"/>
     <w:lsdException w:name="Plain Table 1" w:uiPriority="41"/>
     <w:lsdException w:name="Plain Table 2" w:uiPriority="42"/>
     <w:lsdException w:name="Plain Table 3" w:uiPriority="43"/>
@@ -1633,35 +1733,48 @@
     <w:lsdException w:name="Unresolved Mention" w:semiHidden="1" w:unhideWhenUsed="1"/>
     <w:lsdException w:name="Smart Link" w:semiHidden="1" w:unhideWhenUsed="1"/>
   </w:latentStyles>
-  <w:style w:type="paragraph" w:default="1" w:styleId="Normal">
+  <w:style w:type="paragraph" w:styleId="Normal" w:default="1">
     <w:name w:val="Normal"/>
     <w:qFormat/>
     <w:pPr>
-      <w:spacing w:after="160" w:line="278" w:lineRule="auto"/>
+      <w:widowControl/>
+      <w:suppressAutoHyphens w:val="true"/>
+      <w:bidi w:val="0"/>
+      <w:spacing w:lineRule="auto" w:line="278" w:before="0" w:after="160"/>
+      <w:jc w:val="start"/>
     </w:pPr>
-  </w:style>
-  <w:style w:type="paragraph" w:styleId="Ttulo1">
+    <w:rPr>
+      <w:rFonts w:ascii="Aptos" w:hAnsi="Aptos" w:eastAsia="Aptos" w:cs="" w:asciiTheme="minorHAnsi" w:cstheme="minorBidi" w:eastAsiaTheme="minorHAnsi" w:hAnsiTheme="minorHAnsi"/>
+      <w:color w:val="auto"/>
+      <w:kern w:val="2"/>
+      <w:sz w:val="24"/>
+      <w:szCs w:val="24"/>
+      <w:lang w:val="es-MX" w:eastAsia="en-US" w:bidi="ar-SA"/>
+      <w14:ligatures w14:val="standardContextual"/>
+    </w:rPr>
+  </w:style>
+  <w:style w:type="paragraph" w:styleId="Heading1">
     <w:name w:val="heading 1"/>
     <w:basedOn w:val="Normal"/>
     <w:next w:val="Normal"/>
     <w:link w:val="Ttulo1Car"/>
     <w:uiPriority w:val="9"/>
     <w:qFormat/>
-    <w:rsid w:val="00AD11E5"/>
+    <w:rsid w:val="00ad11e5"/>
     <w:pPr>
-      <w:keepNext/>
+      <w:keepNext w:val="true"/>
       <w:keepLines/>
       <w:spacing w:before="360" w:after="80"/>
       <w:outlineLvl w:val="0"/>
     </w:pPr>
     <w:rPr>
-      <w:rFonts w:asciiTheme="majorHAnsi" w:eastAsiaTheme="majorEastAsia" w:hAnsiTheme="majorHAnsi" w:cstheme="majorBidi"/>
-      <w:color w:val="0F4761" w:themeColor="accent1" w:themeShade="BF"/>
+      <w:rFonts w:ascii="Aptos Display" w:hAnsi="Aptos Display" w:eastAsia="" w:cs="" w:asciiTheme="majorHAnsi" w:cstheme="majorBidi" w:eastAsiaTheme="majorEastAsia" w:hAnsiTheme="majorHAnsi"/>
+      <w:color w:themeColor="accent1" w:themeShade="bf" w:val="0F4761"/>
       <w:sz w:val="40"/>
       <w:szCs w:val="40"/>
     </w:rPr>
   </w:style>
-  <w:style w:type="paragraph" w:styleId="Ttulo2">
+  <w:style w:type="paragraph" w:styleId="Heading2">
     <w:name w:val="heading 2"/>
     <w:basedOn w:val="Normal"/>
     <w:next w:val="Normal"/>
@@ -1670,21 +1783,21 @@
     <w:semiHidden/>
     <w:unhideWhenUsed/>
     <w:qFormat/>
-    <w:rsid w:val="00AD11E5"/>
+    <w:rsid w:val="00ad11e5"/>
     <w:pPr>
-      <w:keepNext/>
+      <w:keepNext w:val="true"/>
       <w:keepLines/>
       <w:spacing w:before="160" w:after="80"/>
       <w:outlineLvl w:val="1"/>
     </w:pPr>
     <w:rPr>
-      <w:rFonts w:asciiTheme="majorHAnsi" w:eastAsiaTheme="majorEastAsia" w:hAnsiTheme="majorHAnsi" w:cstheme="majorBidi"/>
-      <w:color w:val="0F4761" w:themeColor="accent1" w:themeShade="BF"/>
+      <w:rFonts w:ascii="Aptos Display" w:hAnsi="Aptos Display" w:eastAsia="" w:cs="" w:asciiTheme="majorHAnsi" w:cstheme="majorBidi" w:eastAsiaTheme="majorEastAsia" w:hAnsiTheme="majorHAnsi"/>
+      <w:color w:themeColor="accent1" w:themeShade="bf" w:val="0F4761"/>
       <w:sz w:val="32"/>
       <w:szCs w:val="32"/>
     </w:rPr>
   </w:style>
-  <w:style w:type="paragraph" w:styleId="Ttulo3">
+  <w:style w:type="paragraph" w:styleId="Heading3">
     <w:name w:val="heading 3"/>
     <w:basedOn w:val="Normal"/>
     <w:next w:val="Normal"/>
@@ -1693,21 +1806,21 @@
     <w:semiHidden/>
     <w:unhideWhenUsed/>
     <w:qFormat/>
-    <w:rsid w:val="00AD11E5"/>
+    <w:rsid w:val="00ad11e5"/>
     <w:pPr>
-      <w:keepNext/>
+      <w:keepNext w:val="true"/>
       <w:keepLines/>
       <w:spacing w:before="160" w:after="80"/>
       <w:outlineLvl w:val="2"/>
     </w:pPr>
     <w:rPr>
-      <w:rFonts w:eastAsiaTheme="majorEastAsia" w:cstheme="majorBidi"/>
-      <w:color w:val="0F4761" w:themeColor="accent1" w:themeShade="BF"/>
+      <w:rFonts w:eastAsia="" w:cs="" w:cstheme="majorBidi" w:eastAsiaTheme="majorEastAsia"/>
+      <w:color w:themeColor="accent1" w:themeShade="bf" w:val="0F4761"/>
       <w:sz w:val="28"/>
       <w:szCs w:val="28"/>
     </w:rPr>
   </w:style>
-  <w:style w:type="paragraph" w:styleId="Ttulo4">
+  <w:style w:type="paragraph" w:styleId="Heading4">
     <w:name w:val="heading 4"/>
     <w:basedOn w:val="Normal"/>
     <w:next w:val="Normal"/>
@@ -1716,21 +1829,21 @@
     <w:semiHidden/>
     <w:unhideWhenUsed/>
     <w:qFormat/>
-    <w:rsid w:val="00AD11E5"/>
+    <w:rsid w:val="00ad11e5"/>
     <w:pPr>
-      <w:keepNext/>
+      <w:keepNext w:val="true"/>
       <w:keepLines/>
       <w:spacing w:before="80" w:after="40"/>
       <w:outlineLvl w:val="3"/>
     </w:pPr>
     <w:rPr>
-      <w:rFonts w:eastAsiaTheme="majorEastAsia" w:cstheme="majorBidi"/>
+      <w:rFonts w:eastAsia="" w:cs="" w:cstheme="majorBidi" w:eastAsiaTheme="majorEastAsia"/>
       <w:i/>
       <w:iCs/>
-      <w:color w:val="0F4761" w:themeColor="accent1" w:themeShade="BF"/>
-    </w:rPr>
-  </w:style>
-  <w:style w:type="paragraph" w:styleId="Ttulo5">
+      <w:color w:themeColor="accent1" w:themeShade="bf" w:val="0F4761"/>
+    </w:rPr>
+  </w:style>
+  <w:style w:type="paragraph" w:styleId="Heading5">
     <w:name w:val="heading 5"/>
     <w:basedOn w:val="Normal"/>
     <w:next w:val="Normal"/>
@@ -1739,19 +1852,19 @@
     <w:semiHidden/>
     <w:unhideWhenUsed/>
     <w:qFormat/>
-    <w:rsid w:val="00AD11E5"/>
+    <w:rsid w:val="00ad11e5"/>
     <w:pPr>
-      <w:keepNext/>
+      <w:keepNext w:val="true"/>
       <w:keepLines/>
       <w:spacing w:before="80" w:after="40"/>
       <w:outlineLvl w:val="4"/>
     </w:pPr>
     <w:rPr>
-      <w:rFonts w:eastAsiaTheme="majorEastAsia" w:cstheme="majorBidi"/>
-      <w:color w:val="0F4761" w:themeColor="accent1" w:themeShade="BF"/>
-    </w:rPr>
-  </w:style>
-  <w:style w:type="paragraph" w:styleId="Ttulo6">
+      <w:rFonts w:eastAsia="" w:cs="" w:cstheme="majorBidi" w:eastAsiaTheme="majorEastAsia"/>
+      <w:color w:themeColor="accent1" w:themeShade="bf" w:val="0F4761"/>
+    </w:rPr>
+  </w:style>
+  <w:style w:type="paragraph" w:styleId="Heading6">
     <w:name w:val="heading 6"/>
     <w:basedOn w:val="Normal"/>
     <w:next w:val="Normal"/>
@@ -1760,21 +1873,21 @@
     <w:semiHidden/>
     <w:unhideWhenUsed/>
     <w:qFormat/>
-    <w:rsid w:val="00AD11E5"/>
+    <w:rsid w:val="00ad11e5"/>
     <w:pPr>
-      <w:keepNext/>
+      <w:keepNext w:val="true"/>
       <w:keepLines/>
       <w:spacing w:before="40" w:after="0"/>
       <w:outlineLvl w:val="5"/>
     </w:pPr>
     <w:rPr>
-      <w:rFonts w:eastAsiaTheme="majorEastAsia" w:cstheme="majorBidi"/>
+      <w:rFonts w:eastAsia="" w:cs="" w:cstheme="majorBidi" w:eastAsiaTheme="majorEastAsia"/>
       <w:i/>
       <w:iCs/>
-      <w:color w:val="595959" w:themeColor="text1" w:themeTint="A6"/>
-    </w:rPr>
-  </w:style>
-  <w:style w:type="paragraph" w:styleId="Ttulo7">
+      <w:color w:themeColor="text1" w:themeTint="a6" w:val="595959"/>
+    </w:rPr>
+  </w:style>
+  <w:style w:type="paragraph" w:styleId="Heading7">
     <w:name w:val="heading 7"/>
     <w:basedOn w:val="Normal"/>
     <w:next w:val="Normal"/>
@@ -1783,19 +1896,19 @@
     <w:semiHidden/>
     <w:unhideWhenUsed/>
     <w:qFormat/>
-    <w:rsid w:val="00AD11E5"/>
+    <w:rsid w:val="00ad11e5"/>
     <w:pPr>
-      <w:keepNext/>
+      <w:keepNext w:val="true"/>
       <w:keepLines/>
       <w:spacing w:before="40" w:after="0"/>
       <w:outlineLvl w:val="6"/>
     </w:pPr>
     <w:rPr>
-      <w:rFonts w:eastAsiaTheme="majorEastAsia" w:cstheme="majorBidi"/>
-      <w:color w:val="595959" w:themeColor="text1" w:themeTint="A6"/>
-    </w:rPr>
-  </w:style>
-  <w:style w:type="paragraph" w:styleId="Ttulo8">
+      <w:rFonts w:eastAsia="" w:cs="" w:cstheme="majorBidi" w:eastAsiaTheme="majorEastAsia"/>
+      <w:color w:themeColor="text1" w:themeTint="a6" w:val="595959"/>
+    </w:rPr>
+  </w:style>
+  <w:style w:type="paragraph" w:styleId="Heading8">
     <w:name w:val="heading 8"/>
     <w:basedOn w:val="Normal"/>
     <w:next w:val="Normal"/>
@@ -1804,21 +1917,21 @@
     <w:semiHidden/>
     <w:unhideWhenUsed/>
     <w:qFormat/>
-    <w:rsid w:val="00AD11E5"/>
+    <w:rsid w:val="00ad11e5"/>
     <w:pPr>
-      <w:keepNext/>
+      <w:keepNext w:val="true"/>
       <w:keepLines/>
-      <w:spacing w:after="0"/>
+      <w:spacing w:before="0" w:after="0"/>
       <w:outlineLvl w:val="7"/>
     </w:pPr>
     <w:rPr>
-      <w:rFonts w:eastAsiaTheme="majorEastAsia" w:cstheme="majorBidi"/>
+      <w:rFonts w:eastAsia="" w:cs="" w:cstheme="majorBidi" w:eastAsiaTheme="majorEastAsia"/>
       <w:i/>
       <w:iCs/>
-      <w:color w:val="272727" w:themeColor="text1" w:themeTint="D8"/>
-    </w:rPr>
-  </w:style>
-  <w:style w:type="paragraph" w:styleId="Ttulo9">
+      <w:color w:themeColor="text1" w:themeTint="d8" w:val="272727"/>
+    </w:rPr>
+  </w:style>
+  <w:style w:type="paragraph" w:styleId="Heading9">
     <w:name w:val="heading 9"/>
     <w:basedOn w:val="Normal"/>
     <w:next w:val="Normal"/>
@@ -1827,23 +1940,480 @@
     <w:semiHidden/>
     <w:unhideWhenUsed/>
     <w:qFormat/>
-    <w:rsid w:val="00AD11E5"/>
+    <w:rsid w:val="00ad11e5"/>
     <w:pPr>
-      <w:keepNext/>
+      <w:keepNext w:val="true"/>
       <w:keepLines/>
-      <w:spacing w:after="0"/>
+      <w:spacing w:before="0" w:after="0"/>
       <w:outlineLvl w:val="8"/>
     </w:pPr>
     <w:rPr>
-      <w:rFonts w:eastAsiaTheme="majorEastAsia" w:cstheme="majorBidi"/>
-      <w:color w:val="272727" w:themeColor="text1" w:themeTint="D8"/>
-    </w:rPr>
-  </w:style>
-  <w:style w:type="character" w:default="1" w:styleId="Fuentedeprrafopredeter">
+      <w:rFonts w:eastAsia="" w:cs="" w:cstheme="majorBidi" w:eastAsiaTheme="majorEastAsia"/>
+      <w:color w:themeColor="text1" w:themeTint="d8" w:val="272727"/>
+    </w:rPr>
+  </w:style>
+  <w:style w:type="character" w:styleId="DefaultParagraphFont" w:default="1">
     <w:name w:val="Default Paragraph Font"/>
     <w:uiPriority w:val="1"/>
     <w:semiHidden/>
     <w:unhideWhenUsed/>
+    <w:qFormat/>
+    <w:rPr/>
+  </w:style>
+  <w:style w:type="character" w:styleId="Ttulo1Car" w:customStyle="1">
+    <w:name w:val="Título 1 Car"/>
+    <w:basedOn w:val="DefaultParagraphFont"/>
+    <w:link w:val="Heading1"/>
+    <w:uiPriority w:val="9"/>
+    <w:qFormat/>
+    <w:rsid w:val="00ad11e5"/>
+    <w:rPr>
+      <w:rFonts w:ascii="Aptos Display" w:hAnsi="Aptos Display" w:eastAsia="" w:cs="" w:asciiTheme="majorHAnsi" w:cstheme="majorBidi" w:eastAsiaTheme="majorEastAsia" w:hAnsiTheme="majorHAnsi"/>
+      <w:color w:themeColor="accent1" w:themeShade="bf" w:val="0F4761"/>
+      <w:sz w:val="40"/>
+      <w:szCs w:val="40"/>
+    </w:rPr>
+  </w:style>
+  <w:style w:type="character" w:styleId="Ttulo2Car" w:customStyle="1">
+    <w:name w:val="Título 2 Car"/>
+    <w:basedOn w:val="DefaultParagraphFont"/>
+    <w:link w:val="Heading2"/>
+    <w:uiPriority w:val="9"/>
+    <w:semiHidden/>
+    <w:qFormat/>
+    <w:rsid w:val="00ad11e5"/>
+    <w:rPr>
+      <w:rFonts w:ascii="Aptos Display" w:hAnsi="Aptos Display" w:eastAsia="" w:cs="" w:asciiTheme="majorHAnsi" w:cstheme="majorBidi" w:eastAsiaTheme="majorEastAsia" w:hAnsiTheme="majorHAnsi"/>
+      <w:color w:themeColor="accent1" w:themeShade="bf" w:val="0F4761"/>
+      <w:sz w:val="32"/>
+      <w:szCs w:val="32"/>
+    </w:rPr>
+  </w:style>
+  <w:style w:type="character" w:styleId="Ttulo3Car" w:customStyle="1">
+    <w:name w:val="Título 3 Car"/>
+    <w:basedOn w:val="DefaultParagraphFont"/>
+    <w:link w:val="Heading3"/>
+    <w:uiPriority w:val="9"/>
+    <w:semiHidden/>
+    <w:qFormat/>
+    <w:rsid w:val="00ad11e5"/>
+    <w:rPr>
+      <w:rFonts w:eastAsia="" w:cs="" w:cstheme="majorBidi" w:eastAsiaTheme="majorEastAsia"/>
+      <w:color w:themeColor="accent1" w:themeShade="bf" w:val="0F4761"/>
+      <w:sz w:val="28"/>
+      <w:szCs w:val="28"/>
+    </w:rPr>
+  </w:style>
+  <w:style w:type="character" w:styleId="Ttulo4Car" w:customStyle="1">
+    <w:name w:val="Título 4 Car"/>
+    <w:basedOn w:val="DefaultParagraphFont"/>
+    <w:link w:val="Heading4"/>
+    <w:uiPriority w:val="9"/>
+    <w:semiHidden/>
+    <w:qFormat/>
+    <w:rsid w:val="00ad11e5"/>
+    <w:rPr>
+      <w:rFonts w:eastAsia="" w:cs="" w:cstheme="majorBidi" w:eastAsiaTheme="majorEastAsia"/>
+      <w:i/>
+      <w:iCs/>
+      <w:color w:themeColor="accent1" w:themeShade="bf" w:val="0F4761"/>
+    </w:rPr>
+  </w:style>
+  <w:style w:type="character" w:styleId="Ttulo5Car" w:customStyle="1">
+    <w:name w:val="Título 5 Car"/>
+    <w:basedOn w:val="DefaultParagraphFont"/>
+    <w:link w:val="Heading5"/>
+    <w:uiPriority w:val="9"/>
+    <w:semiHidden/>
+    <w:qFormat/>
+    <w:rsid w:val="00ad11e5"/>
+    <w:rPr>
+      <w:rFonts w:eastAsia="" w:cs="" w:cstheme="majorBidi" w:eastAsiaTheme="majorEastAsia"/>
+      <w:color w:themeColor="accent1" w:themeShade="bf" w:val="0F4761"/>
+    </w:rPr>
+  </w:style>
+  <w:style w:type="character" w:styleId="Ttulo6Car" w:customStyle="1">
+    <w:name w:val="Título 6 Car"/>
+    <w:basedOn w:val="DefaultParagraphFont"/>
+    <w:link w:val="Heading6"/>
+    <w:uiPriority w:val="9"/>
+    <w:semiHidden/>
+    <w:qFormat/>
+    <w:rsid w:val="00ad11e5"/>
+    <w:rPr>
+      <w:rFonts w:eastAsia="" w:cs="" w:cstheme="majorBidi" w:eastAsiaTheme="majorEastAsia"/>
+      <w:i/>
+      <w:iCs/>
+      <w:color w:themeColor="text1" w:themeTint="a6" w:val="595959"/>
+    </w:rPr>
+  </w:style>
+  <w:style w:type="character" w:styleId="Ttulo7Car" w:customStyle="1">
+    <w:name w:val="Título 7 Car"/>
+    <w:basedOn w:val="DefaultParagraphFont"/>
+    <w:link w:val="Heading7"/>
+    <w:uiPriority w:val="9"/>
+    <w:semiHidden/>
+    <w:qFormat/>
+    <w:rsid w:val="00ad11e5"/>
+    <w:rPr>
+      <w:rFonts w:eastAsia="" w:cs="" w:cstheme="majorBidi" w:eastAsiaTheme="majorEastAsia"/>
+      <w:color w:themeColor="text1" w:themeTint="a6" w:val="595959"/>
+    </w:rPr>
+  </w:style>
+  <w:style w:type="character" w:styleId="Ttulo8Car" w:customStyle="1">
+    <w:name w:val="Título 8 Car"/>
+    <w:basedOn w:val="DefaultParagraphFont"/>
+    <w:link w:val="Heading8"/>
+    <w:uiPriority w:val="9"/>
+    <w:semiHidden/>
+    <w:qFormat/>
+    <w:rsid w:val="00ad11e5"/>
+    <w:rPr>
+      <w:rFonts w:eastAsia="" w:cs="" w:cstheme="majorBidi" w:eastAsiaTheme="majorEastAsia"/>
+      <w:i/>
+      <w:iCs/>
+      <w:color w:themeColor="text1" w:themeTint="d8" w:val="272727"/>
+    </w:rPr>
+  </w:style>
+  <w:style w:type="character" w:styleId="Ttulo9Car" w:customStyle="1">
+    <w:name w:val="Título 9 Car"/>
+    <w:basedOn w:val="DefaultParagraphFont"/>
+    <w:link w:val="Heading9"/>
+    <w:uiPriority w:val="9"/>
+    <w:semiHidden/>
+    <w:qFormat/>
+    <w:rsid w:val="00ad11e5"/>
+    <w:rPr>
+      <w:rFonts w:eastAsia="" w:cs="" w:cstheme="majorBidi" w:eastAsiaTheme="majorEastAsia"/>
+      <w:color w:themeColor="text1" w:themeTint="d8" w:val="272727"/>
+    </w:rPr>
+  </w:style>
+  <w:style w:type="character" w:styleId="TtuloCar" w:customStyle="1">
+    <w:name w:val="Título Car"/>
+    <w:basedOn w:val="DefaultParagraphFont"/>
+    <w:link w:val="Title"/>
+    <w:uiPriority w:val="10"/>
+    <w:qFormat/>
+    <w:rsid w:val="00ad11e5"/>
+    <w:rPr>
+      <w:rFonts w:ascii="Aptos Display" w:hAnsi="Aptos Display" w:eastAsia="" w:cs="" w:asciiTheme="majorHAnsi" w:cstheme="majorBidi" w:eastAsiaTheme="majorEastAsia" w:hAnsiTheme="majorHAnsi"/>
+      <w:spacing w:val="-10"/>
+      <w:kern w:val="2"/>
+      <w:sz w:val="56"/>
+      <w:szCs w:val="56"/>
+    </w:rPr>
+  </w:style>
+  <w:style w:type="character" w:styleId="SubttuloCar" w:customStyle="1">
+    <w:name w:val="Subtítulo Car"/>
+    <w:basedOn w:val="DefaultParagraphFont"/>
+    <w:link w:val="Subtitle"/>
+    <w:uiPriority w:val="11"/>
+    <w:qFormat/>
+    <w:rsid w:val="00ad11e5"/>
+    <w:rPr>
+      <w:rFonts w:eastAsia="" w:cs="" w:cstheme="majorBidi" w:eastAsiaTheme="majorEastAsia"/>
+      <w:color w:themeColor="text1" w:themeTint="a6" w:val="595959"/>
+      <w:spacing w:val="15"/>
+      <w:sz w:val="28"/>
+      <w:szCs w:val="28"/>
+    </w:rPr>
+  </w:style>
+  <w:style w:type="character" w:styleId="CitaCar" w:customStyle="1">
+    <w:name w:val="Cita Car"/>
+    <w:basedOn w:val="DefaultParagraphFont"/>
+    <w:link w:val="Quote"/>
+    <w:uiPriority w:val="29"/>
+    <w:qFormat/>
+    <w:rsid w:val="00ad11e5"/>
+    <w:rPr>
+      <w:i/>
+      <w:iCs/>
+      <w:color w:themeColor="text1" w:themeTint="bf" w:val="404040"/>
+    </w:rPr>
+  </w:style>
+  <w:style w:type="character" w:styleId="IntenseEmphasis">
+    <w:name w:val="Intense Emphasis"/>
+    <w:basedOn w:val="DefaultParagraphFont"/>
+    <w:uiPriority w:val="21"/>
+    <w:qFormat/>
+    <w:rsid w:val="00ad11e5"/>
+    <w:rPr>
+      <w:i/>
+      <w:iCs/>
+      <w:color w:themeColor="accent1" w:themeShade="bf" w:val="0F4761"/>
+    </w:rPr>
+  </w:style>
+  <w:style w:type="character" w:styleId="CitadestacadaCar" w:customStyle="1">
+    <w:name w:val="Cita destacada Car"/>
+    <w:basedOn w:val="DefaultParagraphFont"/>
+    <w:link w:val="IntenseQuote"/>
+    <w:uiPriority w:val="30"/>
+    <w:qFormat/>
+    <w:rsid w:val="00ad11e5"/>
+    <w:rPr>
+      <w:i/>
+      <w:iCs/>
+      <w:color w:themeColor="accent1" w:themeShade="bf" w:val="0F4761"/>
+    </w:rPr>
+  </w:style>
+  <w:style w:type="character" w:styleId="IntenseReference">
+    <w:name w:val="Intense Reference"/>
+    <w:basedOn w:val="DefaultParagraphFont"/>
+    <w:uiPriority w:val="32"/>
+    <w:qFormat/>
+    <w:rsid w:val="00ad11e5"/>
+    <w:rPr>
+      <w:b/>
+      <w:bCs/>
+      <w:smallCaps/>
+      <w:color w:themeColor="accent1" w:themeShade="bf" w:val="0F4761"/>
+      <w:spacing w:val="5"/>
+    </w:rPr>
+  </w:style>
+  <w:style w:type="character" w:styleId="LineNumber">
+    <w:name w:val="line number"/>
+    <w:rPr/>
+  </w:style>
+  <w:style w:type="character" w:styleId="TextocomentarioCar" w:customStyle="1">
+    <w:name w:val="Texto comentario Car"/>
+    <w:basedOn w:val="DefaultParagraphFont"/>
+    <w:link w:val="CommentText"/>
+    <w:uiPriority w:val="99"/>
+    <w:semiHidden/>
+    <w:qFormat/>
+    <w:rPr>
+      <w:sz w:val="20"/>
+      <w:szCs w:val="20"/>
+    </w:rPr>
+  </w:style>
+  <w:style w:type="character" w:styleId="CommentReference">
+    <w:name w:val="annotation reference"/>
+    <w:basedOn w:val="DefaultParagraphFont"/>
+    <w:uiPriority w:val="99"/>
+    <w:semiHidden/>
+    <w:unhideWhenUsed/>
+    <w:qFormat/>
+    <w:rPr>
+      <w:sz w:val="16"/>
+      <w:szCs w:val="16"/>
+    </w:rPr>
+  </w:style>
+  <w:style w:type="paragraph" w:styleId="Heading" w:customStyle="1">
+    <w:name w:val="Heading"/>
+    <w:basedOn w:val="Normal"/>
+    <w:next w:val="BodyText"/>
+    <w:qFormat/>
+    <w:pPr>
+      <w:keepNext w:val="true"/>
+      <w:spacing w:before="240" w:after="120"/>
+    </w:pPr>
+    <w:rPr>
+      <w:rFonts w:ascii="Liberation Sans" w:hAnsi="Liberation Sans" w:eastAsia="Source Han Sans CN" w:cs="Noto Sans Devanagari"/>
+      <w:sz w:val="28"/>
+      <w:szCs w:val="28"/>
+    </w:rPr>
+  </w:style>
+  <w:style w:type="paragraph" w:styleId="BodyText">
+    <w:name w:val="Body Text"/>
+    <w:basedOn w:val="Normal"/>
+    <w:pPr>
+      <w:spacing w:lineRule="auto" w:line="276" w:before="0" w:after="140"/>
+    </w:pPr>
+    <w:rPr/>
+  </w:style>
+  <w:style w:type="paragraph" w:styleId="List">
+    <w:name w:val="List"/>
+    <w:basedOn w:val="BodyText"/>
+    <w:pPr/>
+    <w:rPr>
+      <w:rFonts w:cs="Noto Sans Devanagari"/>
+    </w:rPr>
+  </w:style>
+  <w:style w:type="paragraph" w:styleId="Caption">
+    <w:name w:val="caption"/>
+    <w:basedOn w:val="Normal"/>
+    <w:qFormat/>
+    <w:pPr>
+      <w:suppressLineNumbers/>
+      <w:spacing w:before="120" w:after="120"/>
+    </w:pPr>
+    <w:rPr>
+      <w:rFonts w:cs="Noto Sans Devanagari"/>
+      <w:i/>
+      <w:iCs/>
+    </w:rPr>
+  </w:style>
+  <w:style w:type="paragraph" w:styleId="Index" w:customStyle="1">
+    <w:name w:val="Index"/>
+    <w:basedOn w:val="Normal"/>
+    <w:qFormat/>
+    <w:pPr>
+      <w:suppressLineNumbers/>
+    </w:pPr>
+    <w:rPr>
+      <w:rFonts w:cs="Noto Sans Devanagari"/>
+    </w:rPr>
+  </w:style>
+  <w:style w:type="paragraph" w:styleId="Title">
+    <w:name w:val="Title"/>
+    <w:basedOn w:val="Normal"/>
+    <w:next w:val="Normal"/>
+    <w:link w:val="TtuloCar"/>
+    <w:uiPriority w:val="10"/>
+    <w:qFormat/>
+    <w:rsid w:val="00ad11e5"/>
+    <w:pPr>
+      <w:spacing w:lineRule="auto" w:line="240" w:before="0" w:after="80"/>
+      <w:contextualSpacing/>
+    </w:pPr>
+    <w:rPr>
+      <w:rFonts w:ascii="Aptos Display" w:hAnsi="Aptos Display" w:eastAsia="" w:cs="" w:asciiTheme="majorHAnsi" w:cstheme="majorBidi" w:eastAsiaTheme="majorEastAsia" w:hAnsiTheme="majorHAnsi"/>
+      <w:spacing w:val="-10"/>
+      <w:sz w:val="56"/>
+      <w:szCs w:val="56"/>
+    </w:rPr>
+  </w:style>
+  <w:style w:type="paragraph" w:styleId="Subtitle">
+    <w:name w:val="Subtitle"/>
+    <w:basedOn w:val="Normal"/>
+    <w:next w:val="Normal"/>
+    <w:link w:val="SubttuloCar"/>
+    <w:uiPriority w:val="11"/>
+    <w:qFormat/>
+    <w:rsid w:val="00ad11e5"/>
+    <w:pPr/>
+    <w:rPr>
+      <w:rFonts w:eastAsia="" w:cs="" w:cstheme="majorBidi" w:eastAsiaTheme="majorEastAsia"/>
+      <w:color w:themeColor="text1" w:themeTint="a6" w:val="595959"/>
+      <w:spacing w:val="15"/>
+      <w:sz w:val="28"/>
+      <w:szCs w:val="28"/>
+    </w:rPr>
+  </w:style>
+  <w:style w:type="paragraph" w:styleId="Quote">
+    <w:name w:val="Quote"/>
+    <w:basedOn w:val="Normal"/>
+    <w:next w:val="Normal"/>
+    <w:link w:val="CitaCar"/>
+    <w:uiPriority w:val="29"/>
+    <w:qFormat/>
+    <w:rsid w:val="00ad11e5"/>
+    <w:pPr>
+      <w:spacing w:before="160" w:after="160"/>
+      <w:jc w:val="center"/>
+    </w:pPr>
+    <w:rPr>
+      <w:i/>
+      <w:iCs/>
+      <w:color w:themeColor="text1" w:themeTint="bf" w:val="404040"/>
+    </w:rPr>
+  </w:style>
+  <w:style w:type="paragraph" w:styleId="ListParagraph">
+    <w:name w:val="List Paragraph"/>
+    <w:basedOn w:val="Normal"/>
+    <w:uiPriority w:val="34"/>
+    <w:qFormat/>
+    <w:rsid w:val="00ad11e5"/>
+    <w:pPr>
+      <w:spacing w:before="0" w:after="160"/>
+      <w:ind w:start="720"/>
+      <w:contextualSpacing/>
+    </w:pPr>
+    <w:rPr/>
+  </w:style>
+  <w:style w:type="paragraph" w:styleId="IntenseQuote">
+    <w:name w:val="Intense Quote"/>
+    <w:basedOn w:val="Normal"/>
+    <w:next w:val="Normal"/>
+    <w:link w:val="CitadestacadaCar"/>
+    <w:uiPriority w:val="30"/>
+    <w:qFormat/>
+    <w:rsid w:val="00ad11e5"/>
+    <w:pPr>
+      <w:pBdr>
+        <w:top w:val="single" w:sz="4" w:space="10" w:color="0F4761" w:themeColor="accent1" w:themeShade="bf"/>
+        <w:bottom w:val="single" w:sz="4" w:space="10" w:color="0F4761" w:themeColor="accent1" w:themeShade="bf"/>
+      </w:pBdr>
+      <w:spacing w:before="360" w:after="360"/>
+      <w:ind w:start="864" w:end="864"/>
+      <w:jc w:val="center"/>
+    </w:pPr>
+    <w:rPr>
+      <w:i/>
+      <w:iCs/>
+      <w:color w:themeColor="accent1" w:themeShade="bf" w:val="0F4761"/>
+    </w:rPr>
+  </w:style>
+  <w:style w:type="paragraph" w:styleId="NormalWeb">
+    <w:name w:val="Normal (Web)"/>
+    <w:basedOn w:val="Normal"/>
+    <w:uiPriority w:val="99"/>
+    <w:semiHidden/>
+    <w:unhideWhenUsed/>
+    <w:qFormat/>
+    <w:rsid w:val="000d3686"/>
+    <w:pPr/>
+    <w:rPr>
+      <w:rFonts w:ascii="Times New Roman" w:hAnsi="Times New Roman" w:cs="Times New Roman"/>
+    </w:rPr>
+  </w:style>
+  <w:style w:type="paragraph" w:styleId="Comment" w:customStyle="1">
+    <w:name w:val="Comment"/>
+    <w:basedOn w:val="Normal"/>
+    <w:qFormat/>
+    <w:pPr>
+      <w:spacing w:lineRule="auto" w:line="240" w:before="56" w:after="0"/>
+      <w:ind w:start="57" w:end="57"/>
+    </w:pPr>
+    <w:rPr>
+      <w:sz w:val="20"/>
+      <w:szCs w:val="20"/>
+    </w:rPr>
+  </w:style>
+  <w:style w:type="paragraph" w:styleId="CommentText">
+    <w:name w:val="annotation text"/>
+    <w:basedOn w:val="Normal"/>
+    <w:link w:val="TextocomentarioCar"/>
+    <w:uiPriority w:val="99"/>
+    <w:semiHidden/>
+    <w:unhideWhenUsed/>
+    <w:pPr>
+      <w:spacing w:lineRule="auto" w:line="240"/>
+    </w:pPr>
+    <w:rPr>
+      <w:sz w:val="20"/>
+      <w:szCs w:val="20"/>
+    </w:rPr>
+  </w:style>
+  <w:style w:type="paragraph" w:styleId="Revision">
+    <w:name w:val="Revision"/>
+    <w:uiPriority w:val="99"/>
+    <w:semiHidden/>
+    <w:qFormat/>
+    <w:rsid w:val="00383ad3"/>
+    <w:pPr>
+      <w:widowControl/>
+      <w:suppressAutoHyphens w:val="false"/>
+      <w:bidi w:val="0"/>
+      <w:spacing w:before="0" w:after="0"/>
+      <w:jc w:val="start"/>
+    </w:pPr>
+    <w:rPr>
+      <w:rFonts w:ascii="Aptos" w:hAnsi="Aptos" w:eastAsia="Aptos" w:cs="" w:asciiTheme="minorHAnsi" w:cstheme="minorBidi" w:eastAsiaTheme="minorHAnsi" w:hAnsiTheme="minorHAnsi"/>
+      <w:color w:val="auto"/>
+      <w:kern w:val="2"/>
+      <w:sz w:val="24"/>
+      <w:szCs w:val="24"/>
+      <w:lang w:val="es-MX" w:eastAsia="en-US" w:bidi="ar-SA"/>
+      <w14:ligatures w14:val="standardContextual"/>
+    </w:rPr>
+  </w:style>
+  <w:style w:type="numbering" w:styleId="NoList" w:default="1">
+    <w:name w:val="No List"/>
+    <w:uiPriority w:val="99"/>
+    <w:semiHidden/>
+    <w:unhideWhenUsed/>
+    <w:qFormat/>
   </w:style>
   <w:style w:type="table" w:default="1" w:styleId="Tablanormal">
     <w:name w:val="Normal Table"/>
@@ -1851,7 +2421,6 @@
     <w:semiHidden/>
     <w:unhideWhenUsed/>
     <w:tblPr>
-      <w:tblInd w:w="0" w:type="dxa"/>
       <w:tblCellMar>
         <w:top w:w="0" w:type="dxa"/>
         <w:left w:w="108" w:type="dxa"/>
@@ -1860,492 +2429,58 @@
       </w:tblCellMar>
     </w:tblPr>
   </w:style>
-  <w:style w:type="numbering" w:default="1" w:styleId="Sinlista">
-    <w:name w:val="No List"/>
-    <w:uiPriority w:val="99"/>
-    <w:semiHidden/>
-    <w:unhideWhenUsed/>
-  </w:style>
-  <w:style w:type="character" w:customStyle="1" w:styleId="Ttulo1Car">
-    <w:name w:val="Título 1 Car"/>
-    <w:basedOn w:val="Fuentedeprrafopredeter"/>
-    <w:link w:val="Ttulo1"/>
-    <w:uiPriority w:val="9"/>
-    <w:qFormat/>
-    <w:rsid w:val="00AD11E5"/>
-    <w:rPr>
-      <w:rFonts w:asciiTheme="majorHAnsi" w:eastAsiaTheme="majorEastAsia" w:hAnsiTheme="majorHAnsi" w:cstheme="majorBidi"/>
-      <w:color w:val="0F4761" w:themeColor="accent1" w:themeShade="BF"/>
-      <w:sz w:val="40"/>
-      <w:szCs w:val="40"/>
-    </w:rPr>
-  </w:style>
-  <w:style w:type="character" w:customStyle="1" w:styleId="Ttulo2Car">
-    <w:name w:val="Título 2 Car"/>
-    <w:basedOn w:val="Fuentedeprrafopredeter"/>
-    <w:link w:val="Ttulo2"/>
-    <w:uiPriority w:val="9"/>
-    <w:semiHidden/>
-    <w:qFormat/>
-    <w:rsid w:val="00AD11E5"/>
-    <w:rPr>
-      <w:rFonts w:asciiTheme="majorHAnsi" w:eastAsiaTheme="majorEastAsia" w:hAnsiTheme="majorHAnsi" w:cstheme="majorBidi"/>
-      <w:color w:val="0F4761" w:themeColor="accent1" w:themeShade="BF"/>
-      <w:sz w:val="32"/>
-      <w:szCs w:val="32"/>
-    </w:rPr>
-  </w:style>
-  <w:style w:type="character" w:customStyle="1" w:styleId="Ttulo3Car">
-    <w:name w:val="Título 3 Car"/>
-    <w:basedOn w:val="Fuentedeprrafopredeter"/>
-    <w:link w:val="Ttulo3"/>
-    <w:uiPriority w:val="9"/>
-    <w:semiHidden/>
-    <w:qFormat/>
-    <w:rsid w:val="00AD11E5"/>
-    <w:rPr>
-      <w:rFonts w:eastAsiaTheme="majorEastAsia" w:cstheme="majorBidi"/>
-      <w:color w:val="0F4761" w:themeColor="accent1" w:themeShade="BF"/>
-      <w:sz w:val="28"/>
-      <w:szCs w:val="28"/>
-    </w:rPr>
-  </w:style>
-  <w:style w:type="character" w:customStyle="1" w:styleId="Ttulo4Car">
-    <w:name w:val="Título 4 Car"/>
-    <w:basedOn w:val="Fuentedeprrafopredeter"/>
-    <w:link w:val="Ttulo4"/>
-    <w:uiPriority w:val="9"/>
-    <w:semiHidden/>
-    <w:qFormat/>
-    <w:rsid w:val="00AD11E5"/>
-    <w:rPr>
-      <w:rFonts w:eastAsiaTheme="majorEastAsia" w:cstheme="majorBidi"/>
-      <w:i/>
-      <w:iCs/>
-      <w:color w:val="0F4761" w:themeColor="accent1" w:themeShade="BF"/>
-    </w:rPr>
-  </w:style>
-  <w:style w:type="character" w:customStyle="1" w:styleId="Ttulo5Car">
-    <w:name w:val="Título 5 Car"/>
-    <w:basedOn w:val="Fuentedeprrafopredeter"/>
-    <w:link w:val="Ttulo5"/>
-    <w:uiPriority w:val="9"/>
-    <w:semiHidden/>
-    <w:qFormat/>
-    <w:rsid w:val="00AD11E5"/>
-    <w:rPr>
-      <w:rFonts w:eastAsiaTheme="majorEastAsia" w:cstheme="majorBidi"/>
-      <w:color w:val="0F4761" w:themeColor="accent1" w:themeShade="BF"/>
-    </w:rPr>
-  </w:style>
-  <w:style w:type="character" w:customStyle="1" w:styleId="Ttulo6Car">
-    <w:name w:val="Título 6 Car"/>
-    <w:basedOn w:val="Fuentedeprrafopredeter"/>
-    <w:link w:val="Ttulo6"/>
-    <w:uiPriority w:val="9"/>
-    <w:semiHidden/>
-    <w:qFormat/>
-    <w:rsid w:val="00AD11E5"/>
-    <w:rPr>
-      <w:rFonts w:eastAsiaTheme="majorEastAsia" w:cstheme="majorBidi"/>
-      <w:i/>
-      <w:iCs/>
-      <w:color w:val="595959" w:themeColor="text1" w:themeTint="A6"/>
-    </w:rPr>
-  </w:style>
-  <w:style w:type="character" w:customStyle="1" w:styleId="Ttulo7Car">
-    <w:name w:val="Título 7 Car"/>
-    <w:basedOn w:val="Fuentedeprrafopredeter"/>
-    <w:link w:val="Ttulo7"/>
-    <w:uiPriority w:val="9"/>
-    <w:semiHidden/>
-    <w:qFormat/>
-    <w:rsid w:val="00AD11E5"/>
-    <w:rPr>
-      <w:rFonts w:eastAsiaTheme="majorEastAsia" w:cstheme="majorBidi"/>
-      <w:color w:val="595959" w:themeColor="text1" w:themeTint="A6"/>
-    </w:rPr>
-  </w:style>
-  <w:style w:type="character" w:customStyle="1" w:styleId="Ttulo8Car">
-    <w:name w:val="Título 8 Car"/>
-    <w:basedOn w:val="Fuentedeprrafopredeter"/>
-    <w:link w:val="Ttulo8"/>
-    <w:uiPriority w:val="9"/>
-    <w:semiHidden/>
-    <w:qFormat/>
-    <w:rsid w:val="00AD11E5"/>
-    <w:rPr>
-      <w:rFonts w:eastAsiaTheme="majorEastAsia" w:cstheme="majorBidi"/>
-      <w:i/>
-      <w:iCs/>
-      <w:color w:val="272727" w:themeColor="text1" w:themeTint="D8"/>
-    </w:rPr>
-  </w:style>
-  <w:style w:type="character" w:customStyle="1" w:styleId="Ttulo9Car">
-    <w:name w:val="Título 9 Car"/>
-    <w:basedOn w:val="Fuentedeprrafopredeter"/>
-    <w:link w:val="Ttulo9"/>
-    <w:uiPriority w:val="9"/>
-    <w:semiHidden/>
-    <w:qFormat/>
-    <w:rsid w:val="00AD11E5"/>
-    <w:rPr>
-      <w:rFonts w:eastAsiaTheme="majorEastAsia" w:cstheme="majorBidi"/>
-      <w:color w:val="272727" w:themeColor="text1" w:themeTint="D8"/>
-    </w:rPr>
-  </w:style>
-  <w:style w:type="character" w:customStyle="1" w:styleId="TtuloCar">
-    <w:name w:val="Título Car"/>
-    <w:basedOn w:val="Fuentedeprrafopredeter"/>
-    <w:link w:val="Ttulo"/>
-    <w:uiPriority w:val="10"/>
-    <w:qFormat/>
-    <w:rsid w:val="00AD11E5"/>
-    <w:rPr>
-      <w:rFonts w:asciiTheme="majorHAnsi" w:eastAsiaTheme="majorEastAsia" w:hAnsiTheme="majorHAnsi" w:cstheme="majorBidi"/>
-      <w:spacing w:val="-10"/>
-      <w:kern w:val="2"/>
-      <w:sz w:val="56"/>
-      <w:szCs w:val="56"/>
-    </w:rPr>
-  </w:style>
-  <w:style w:type="character" w:customStyle="1" w:styleId="SubttuloCar">
-    <w:name w:val="Subtítulo Car"/>
-    <w:basedOn w:val="Fuentedeprrafopredeter"/>
-    <w:link w:val="Subttulo"/>
-    <w:uiPriority w:val="11"/>
-    <w:qFormat/>
-    <w:rsid w:val="00AD11E5"/>
-    <w:rPr>
-      <w:rFonts w:eastAsiaTheme="majorEastAsia" w:cstheme="majorBidi"/>
-      <w:color w:val="595959" w:themeColor="text1" w:themeTint="A6"/>
-      <w:spacing w:val="15"/>
-      <w:sz w:val="28"/>
-      <w:szCs w:val="28"/>
-    </w:rPr>
-  </w:style>
-  <w:style w:type="character" w:customStyle="1" w:styleId="CitaCar">
-    <w:name w:val="Cita Car"/>
-    <w:basedOn w:val="Fuentedeprrafopredeter"/>
-    <w:link w:val="Cita"/>
-    <w:uiPriority w:val="29"/>
-    <w:qFormat/>
-    <w:rsid w:val="00AD11E5"/>
-    <w:rPr>
-      <w:i/>
-      <w:iCs/>
-      <w:color w:val="404040" w:themeColor="text1" w:themeTint="BF"/>
-    </w:rPr>
-  </w:style>
-  <w:style w:type="character" w:styleId="nfasisintenso">
-    <w:name w:val="Intense Emphasis"/>
-    <w:basedOn w:val="Fuentedeprrafopredeter"/>
-    <w:uiPriority w:val="21"/>
-    <w:qFormat/>
-    <w:rsid w:val="00AD11E5"/>
-    <w:rPr>
-      <w:i/>
-      <w:iCs/>
-      <w:color w:val="0F4761" w:themeColor="accent1" w:themeShade="BF"/>
-    </w:rPr>
-  </w:style>
-  <w:style w:type="character" w:customStyle="1" w:styleId="CitadestacadaCar">
-    <w:name w:val="Cita destacada Car"/>
-    <w:basedOn w:val="Fuentedeprrafopredeter"/>
-    <w:link w:val="Citadestacada"/>
-    <w:uiPriority w:val="30"/>
-    <w:qFormat/>
-    <w:rsid w:val="00AD11E5"/>
-    <w:rPr>
-      <w:i/>
-      <w:iCs/>
-      <w:color w:val="0F4761" w:themeColor="accent1" w:themeShade="BF"/>
-    </w:rPr>
-  </w:style>
-  <w:style w:type="character" w:styleId="Referenciaintensa">
-    <w:name w:val="Intense Reference"/>
-    <w:basedOn w:val="Fuentedeprrafopredeter"/>
-    <w:uiPriority w:val="32"/>
-    <w:qFormat/>
-    <w:rsid w:val="00AD11E5"/>
-    <w:rPr>
-      <w:b/>
-      <w:bCs/>
-      <w:smallCaps/>
-      <w:color w:val="0F4761" w:themeColor="accent1" w:themeShade="BF"/>
-      <w:spacing w:val="5"/>
-    </w:rPr>
-  </w:style>
-  <w:style w:type="character" w:styleId="Nmerodelnea">
-    <w:name w:val="line number"/>
-  </w:style>
-  <w:style w:type="character" w:customStyle="1" w:styleId="TextocomentarioCar">
-    <w:name w:val="Texto comentario Car"/>
-    <w:basedOn w:val="Fuentedeprrafopredeter"/>
-    <w:link w:val="Textocomentario"/>
-    <w:uiPriority w:val="99"/>
-    <w:semiHidden/>
-    <w:qFormat/>
-    <w:rPr>
-      <w:sz w:val="20"/>
-      <w:szCs w:val="20"/>
-    </w:rPr>
-  </w:style>
-  <w:style w:type="character" w:styleId="Refdecomentario">
-    <w:name w:val="annotation reference"/>
-    <w:basedOn w:val="Fuentedeprrafopredeter"/>
-    <w:uiPriority w:val="99"/>
-    <w:semiHidden/>
-    <w:unhideWhenUsed/>
-    <w:qFormat/>
-    <w:rPr>
-      <w:sz w:val="16"/>
-      <w:szCs w:val="16"/>
-    </w:rPr>
-  </w:style>
-  <w:style w:type="paragraph" w:customStyle="1" w:styleId="Heading">
-    <w:name w:val="Heading"/>
-    <w:basedOn w:val="Normal"/>
-    <w:next w:val="Textoindependiente"/>
-    <w:qFormat/>
-    <w:pPr>
-      <w:keepNext/>
-      <w:spacing w:before="240" w:after="120"/>
-    </w:pPr>
-    <w:rPr>
-      <w:rFonts w:ascii="Liberation Sans" w:eastAsia="Source Han Sans CN" w:hAnsi="Liberation Sans" w:cs="Noto Sans Devanagari"/>
-      <w:sz w:val="28"/>
-      <w:szCs w:val="28"/>
-    </w:rPr>
-  </w:style>
-  <w:style w:type="paragraph" w:styleId="Textoindependiente">
-    <w:name w:val="Body Text"/>
-    <w:basedOn w:val="Normal"/>
-    <w:pPr>
-      <w:spacing w:after="140" w:line="276" w:lineRule="auto"/>
-    </w:pPr>
-  </w:style>
-  <w:style w:type="paragraph" w:styleId="Lista">
-    <w:name w:val="List"/>
-    <w:basedOn w:val="Textoindependiente"/>
-    <w:rPr>
-      <w:rFonts w:cs="Noto Sans Devanagari"/>
-    </w:rPr>
-  </w:style>
-  <w:style w:type="paragraph" w:styleId="Descripcin">
-    <w:name w:val="caption"/>
-    <w:basedOn w:val="Normal"/>
-    <w:qFormat/>
-    <w:pPr>
-      <w:suppressLineNumbers/>
-      <w:spacing w:before="120" w:after="120"/>
-    </w:pPr>
-    <w:rPr>
-      <w:rFonts w:cs="Noto Sans Devanagari"/>
-      <w:i/>
-      <w:iCs/>
-    </w:rPr>
-  </w:style>
-  <w:style w:type="paragraph" w:customStyle="1" w:styleId="Index">
-    <w:name w:val="Index"/>
-    <w:basedOn w:val="Normal"/>
-    <w:qFormat/>
-    <w:pPr>
-      <w:suppressLineNumbers/>
-    </w:pPr>
-    <w:rPr>
-      <w:rFonts w:cs="Noto Sans Devanagari"/>
-    </w:rPr>
-  </w:style>
-  <w:style w:type="paragraph" w:styleId="Ttulo">
-    <w:name w:val="Title"/>
-    <w:basedOn w:val="Normal"/>
-    <w:next w:val="Normal"/>
-    <w:link w:val="TtuloCar"/>
-    <w:uiPriority w:val="10"/>
-    <w:qFormat/>
-    <w:rsid w:val="00AD11E5"/>
-    <w:pPr>
-      <w:spacing w:after="80" w:line="240" w:lineRule="auto"/>
-      <w:contextualSpacing/>
-    </w:pPr>
-    <w:rPr>
-      <w:rFonts w:asciiTheme="majorHAnsi" w:eastAsiaTheme="majorEastAsia" w:hAnsiTheme="majorHAnsi" w:cstheme="majorBidi"/>
-      <w:spacing w:val="-10"/>
-      <w:sz w:val="56"/>
-      <w:szCs w:val="56"/>
-    </w:rPr>
-  </w:style>
-  <w:style w:type="paragraph" w:styleId="Subttulo">
-    <w:name w:val="Subtitle"/>
-    <w:basedOn w:val="Normal"/>
-    <w:next w:val="Normal"/>
-    <w:link w:val="SubttuloCar"/>
-    <w:uiPriority w:val="11"/>
-    <w:qFormat/>
-    <w:rsid w:val="00AD11E5"/>
-    <w:rPr>
-      <w:rFonts w:eastAsiaTheme="majorEastAsia" w:cstheme="majorBidi"/>
-      <w:color w:val="595959" w:themeColor="text1" w:themeTint="A6"/>
-      <w:spacing w:val="15"/>
-      <w:sz w:val="28"/>
-      <w:szCs w:val="28"/>
-    </w:rPr>
-  </w:style>
-  <w:style w:type="paragraph" w:styleId="Cita">
-    <w:name w:val="Quote"/>
-    <w:basedOn w:val="Normal"/>
-    <w:next w:val="Normal"/>
-    <w:link w:val="CitaCar"/>
-    <w:uiPriority w:val="29"/>
-    <w:qFormat/>
-    <w:rsid w:val="00AD11E5"/>
-    <w:pPr>
-      <w:spacing w:before="160"/>
-      <w:jc w:val="center"/>
-    </w:pPr>
-    <w:rPr>
-      <w:i/>
-      <w:iCs/>
-      <w:color w:val="404040" w:themeColor="text1" w:themeTint="BF"/>
-    </w:rPr>
-  </w:style>
-  <w:style w:type="paragraph" w:styleId="Prrafodelista">
-    <w:name w:val="List Paragraph"/>
-    <w:basedOn w:val="Normal"/>
-    <w:uiPriority w:val="34"/>
-    <w:qFormat/>
-    <w:rsid w:val="00AD11E5"/>
-    <w:pPr>
-      <w:ind w:left="720"/>
-      <w:contextualSpacing/>
-    </w:pPr>
-  </w:style>
-  <w:style w:type="paragraph" w:styleId="Citadestacada">
-    <w:name w:val="Intense Quote"/>
-    <w:basedOn w:val="Normal"/>
-    <w:next w:val="Normal"/>
-    <w:link w:val="CitadestacadaCar"/>
-    <w:uiPriority w:val="30"/>
-    <w:qFormat/>
-    <w:rsid w:val="00AD11E5"/>
-    <w:pPr>
-      <w:pBdr>
-        <w:top w:val="single" w:sz="4" w:space="10" w:color="0F4761" w:themeColor="accent1" w:themeShade="BF"/>
-        <w:bottom w:val="single" w:sz="4" w:space="10" w:color="0F4761" w:themeColor="accent1" w:themeShade="BF"/>
-      </w:pBdr>
-      <w:spacing w:before="360" w:after="360"/>
-      <w:ind w:left="864" w:right="864"/>
-      <w:jc w:val="center"/>
-    </w:pPr>
-    <w:rPr>
-      <w:i/>
-      <w:iCs/>
-      <w:color w:val="0F4761" w:themeColor="accent1" w:themeShade="BF"/>
-    </w:rPr>
-  </w:style>
-  <w:style w:type="paragraph" w:styleId="NormalWeb">
-    <w:name w:val="Normal (Web)"/>
-    <w:basedOn w:val="Normal"/>
-    <w:uiPriority w:val="99"/>
-    <w:semiHidden/>
-    <w:unhideWhenUsed/>
-    <w:qFormat/>
-    <w:rsid w:val="000D3686"/>
-    <w:rPr>
-      <w:rFonts w:ascii="Times New Roman" w:hAnsi="Times New Roman" w:cs="Times New Roman"/>
-    </w:rPr>
-  </w:style>
-  <w:style w:type="paragraph" w:customStyle="1" w:styleId="Comment">
-    <w:name w:val="Comment"/>
-    <w:basedOn w:val="Normal"/>
-    <w:qFormat/>
-    <w:pPr>
-      <w:spacing w:before="56" w:after="0" w:line="240" w:lineRule="auto"/>
-      <w:ind w:left="57" w:right="57"/>
-    </w:pPr>
-    <w:rPr>
-      <w:sz w:val="20"/>
-      <w:szCs w:val="20"/>
-    </w:rPr>
-  </w:style>
-  <w:style w:type="paragraph" w:styleId="Textocomentario">
-    <w:name w:val="annotation text"/>
-    <w:basedOn w:val="Normal"/>
-    <w:link w:val="TextocomentarioCar"/>
-    <w:uiPriority w:val="99"/>
-    <w:semiHidden/>
-    <w:unhideWhenUsed/>
-    <w:pPr>
-      <w:spacing w:line="240" w:lineRule="auto"/>
-    </w:pPr>
-    <w:rPr>
-      <w:sz w:val="20"/>
-      <w:szCs w:val="20"/>
-    </w:rPr>
-  </w:style>
-  <w:style w:type="paragraph" w:styleId="Revisin">
-    <w:name w:val="Revision"/>
-    <w:uiPriority w:val="99"/>
-    <w:semiHidden/>
-    <w:qFormat/>
-    <w:rsid w:val="00383AD3"/>
-    <w:pPr>
-      <w:suppressAutoHyphens w:val="0"/>
-    </w:pPr>
-  </w:style>
 </w:styles>
 </file>
 
 <file path=word/theme/theme1.xml><?xml version="1.0" encoding="utf-8"?>
-<a:theme xmlns:a="http://schemas.openxmlformats.org/drawingml/2006/main" name="Tema de Office">
+<a:theme xmlns:a="http://schemas.openxmlformats.org/drawingml/2006/main" xmlns:r="http://schemas.openxmlformats.org/officeDocument/2006/relationships" name="Tema de Office">
   <a:themeElements>
     <a:clrScheme name="Office">
       <a:dk1>
         <a:srgbClr val="000000"/>
       </a:dk1>
       <a:lt1>
-        <a:srgbClr val="FFFFFF"/>
+        <a:srgbClr val="ffffff"/>
       </a:lt1>
       <a:dk2>
-        <a:srgbClr val="0E2841"/>
+        <a:srgbClr val="0e2841"/>
       </a:dk2>
       <a:lt2>
-        <a:srgbClr val="E8E8E8"/>
+        <a:srgbClr val="e8e8e8"/>
       </a:lt2>
       <a:accent1>
         <a:srgbClr val="156082"/>
       </a:accent1>
       <a:accent2>
-        <a:srgbClr val="E97132"/>
+        <a:srgbClr val="e97132"/>
       </a:accent2>
       <a:accent3>
-        <a:srgbClr val="196B24"/>
+        <a:srgbClr val="196b24"/>
       </a:accent3>
       <a:accent4>
-        <a:srgbClr val="0F9ED5"/>
+        <a:srgbClr val="0f9ed5"/>
       </a:accent4>
       <a:accent5>
-        <a:srgbClr val="A02B93"/>
+        <a:srgbClr val="a02b93"/>
       </a:accent5>
       <a:accent6>
-        <a:srgbClr val="4EA72E"/>
+        <a:srgbClr val="4ea72e"/>
       </a:accent6>
       <a:hlink>
         <a:srgbClr val="467886"/>
       </a:hlink>
       <a:folHlink>
-        <a:srgbClr val="96607D"/>
+        <a:srgbClr val="96607d"/>
       </a:folHlink>
     </a:clrScheme>
     <a:fontScheme name="Office">
       <a:majorFont>
-        <a:latin typeface="Aptos Display" panose="02110004020202020204"/>
+        <a:latin typeface="Aptos Display" panose="02110004020202020204" pitchFamily="0" charset="1"/>
         <a:ea typeface=""/>
         <a:cs typeface=""/>
       </a:majorFont>
       <a:minorFont>
-        <a:latin typeface="Aptos" panose="02110004020202020204"/>
+        <a:latin typeface="Aptos" panose="02110004020202020204" pitchFamily="0" charset="1"/>
         <a:ea typeface=""/>
         <a:cs typeface=""/>
       </a:minorFont>
@@ -2377,7 +2512,7 @@
             </a:gs>
           </a:gsLst>
           <a:lin ang="5400000" scaled="0"/>
-          <a:tileRect/>
+          <a:tileRect l="0" t="0" r="0" b="0"/>
         </a:gradFill>
         <a:gradFill>
           <a:gsLst>
@@ -2401,7 +2536,7 @@
             </a:gs>
           </a:gsLst>
           <a:lin ang="5400000" scaled="0"/>
-          <a:tileRect/>
+          <a:tileRect l="0" t="0" r="0" b="0"/>
         </a:gradFill>
       </a:fillStyleLst>
       <a:lnStyleLst>
@@ -2461,12 +2596,10 @@
             </a:gs>
           </a:gsLst>
           <a:lin ang="5400000" scaled="0"/>
-          <a:tileRect/>
+          <a:tileRect l="0" t="0" r="0" b="0"/>
         </a:gradFill>
       </a:bgFillStyleLst>
     </a:fmtScheme>
   </a:themeElements>
-  <a:objectDefaults/>
-  <a:extraClrSchemeLst/>
 </a:theme>
 </file>
</xml_diff>